<commit_message>
chore: update documentation for project progress and user management
</commit_message>
<xml_diff>
--- a/小组项目报告-已完成.docx
+++ b/小组项目报告-已完成.docx
@@ -2,6 +2,8 @@
 <file path=word/document.xml><?xml version="1.0" encoding="utf-8"?>
 <w:document xmlns:wpc="http://schemas.microsoft.com/office/word/2010/wordprocessingCanvas" xmlns:cx="http://schemas.microsoft.com/office/drawing/2014/chartex" xmlns:cx1="http://schemas.microsoft.com/office/drawing/2015/9/8/chartex" xmlns:cx2="http://schemas.microsoft.com/office/drawing/2015/10/21/chartex" xmlns:cx3="http://schemas.microsoft.com/office/drawing/2016/5/9/chartex" xmlns:cx4="http://schemas.microsoft.com/office/drawing/2016/5/10/chartex" xmlns:cx5="http://schemas.microsoft.com/office/drawing/2016/5/11/chartex" xmlns:cx6="http://schemas.microsoft.com/office/drawing/2016/5/12/chartex" xmlns:cx7="http://schemas.microsoft.com/office/drawing/2016/5/13/chartex" xmlns:cx8="http://schemas.microsoft.com/office/drawing/2016/5/14/chartex" xmlns:mc="http://schemas.openxmlformats.org/markup-compatibility/2006" xmlns:aink="http://schemas.microsoft.com/office/drawing/2016/ink" xmlns:am3d="http://schemas.microsoft.com/office/drawing/2017/model3d" xmlns:o="urn:schemas-microsoft-com:office:office" xmlns:r="http://schemas.openxmlformats.org/officeDocument/2006/relationships" xmlns:m="http://schemas.openxmlformats.org/officeDocument/2006/math" xmlns:v="urn:schemas-microsoft-com:vml" xmlns:wp14="http://schemas.microsoft.com/office/word/2010/wordprocessingDrawing" xmlns:wp="http://schemas.openxmlformats.org/drawingml/2006/wordprocessingDrawing" xmlns:w10="urn:schemas-microsoft-com:office:word" xmlns:w="http://schemas.openxmlformats.org/wordprocessingml/2006/main" xmlns:w14="http://schemas.microsoft.com/office/word/2010/wordml" xmlns:w15="http://schemas.microsoft.com/office/word/2012/wordml" xmlns:w16cex="http://schemas.microsoft.com/office/word/2018/wordml/cex" xmlns:w16cid="http://schemas.microsoft.com/office/word/2016/wordml/cid" xmlns:w16="http://schemas.microsoft.com/office/word/2018/wordml" xmlns:w16sdtdh="http://schemas.microsoft.com/office/word/2020/wordml/sdtdatahash" xmlns:w16se="http://schemas.microsoft.com/office/word/2015/wordml/symex" xmlns:wpg="http://schemas.microsoft.com/office/word/2010/wordprocessingGroup" xmlns:wpi="http://schemas.microsoft.com/office/word/2010/wordprocessingInk" xmlns:wne="http://schemas.microsoft.com/office/word/2006/wordml" xmlns:wps="http://schemas.microsoft.com/office/word/2010/wordprocessingShape" mc:Ignorable="w14 w15 w16se w16cid w16 w16cex w16sdtdh wp14">
   <w:body>
+    <w:bookmarkStart w:id="0" w:name="_Toc364588076"/>
+    <w:bookmarkStart w:id="1" w:name="_Toc32473"/>
     <w:p>
       <w:pPr>
         <w:pStyle w:val="1"/>
@@ -11,8 +13,6 @@
           <w:lang w:eastAsia="zh-CN"/>
         </w:rPr>
       </w:pPr>
-      <w:bookmarkStart w:id="0" w:name="_Toc364588076"/>
-      <w:bookmarkStart w:id="1" w:name="_Toc32473"/>
       <w:r>
         <w:rPr>
           <w:noProof/>
@@ -324,7 +324,23 @@
                                 <w:rFonts w:ascii="宋体" w:eastAsia="宋体" w:hAnsi="宋体" w:hint="eastAsia"/>
                                 <w:lang w:eastAsia="zh-CN"/>
                               </w:rPr>
-                              <w:t xml:space="preserve">组员：张道航 </w:t>
+                              <w:t>组员：</w:t>
+                            </w:r>
+                            <w:proofErr w:type="gramStart"/>
+                            <w:r>
+                              <w:rPr>
+                                <w:rFonts w:ascii="宋体" w:eastAsia="宋体" w:hAnsi="宋体" w:hint="eastAsia"/>
+                                <w:lang w:eastAsia="zh-CN"/>
+                              </w:rPr>
+                              <w:t>张道航</w:t>
+                            </w:r>
+                            <w:proofErr w:type="gramEnd"/>
+                            <w:r>
+                              <w:rPr>
+                                <w:rFonts w:ascii="宋体" w:eastAsia="宋体" w:hAnsi="宋体" w:hint="eastAsia"/>
+                                <w:lang w:eastAsia="zh-CN"/>
+                              </w:rPr>
+                              <w:t xml:space="preserve"> </w:t>
                             </w:r>
                             <w:r>
                               <w:rPr>
@@ -1077,7 +1093,15 @@
         <w:t xml:space="preserve"> Java </w:t>
       </w:r>
       <w:r>
-        <w:t>的校园综合管理应用。项目以真实校园业务中分散的信息与服务为背景，将用户管理、学生学籍、选课、图书借阅和校园商城五个必做模块整合到统一客户端中，并由统一服务端和</w:t>
+        <w:t>的校园综合管理应用。项目以真实校园业务中分散的信息与服务为背景，将用户管理、学生学籍、选课、图书借阅和校园商城五</w:t>
+      </w:r>
+      <w:proofErr w:type="gramStart"/>
+      <w:r>
+        <w:t>个</w:t>
+      </w:r>
+      <w:proofErr w:type="gramEnd"/>
+      <w:r>
+        <w:t>必做模块整合到统一客户端中，并由统一服务端和</w:t>
       </w:r>
       <w:r>
         <w:t xml:space="preserve"> Microsoft Access </w:t>
@@ -1103,7 +1127,23 @@
         <w:t xml:space="preserve">Socket </w:t>
       </w:r>
       <w:r>
-        <w:t>通信、数据库管理、团队协作和规范化文档。我们据此将工作划分为用户、选课、学籍、图书和商城五个纵向业务模块：梁灏才负责用户模块并承担组长工作，刘宇帆负责选课模块，郭昀坤负责学籍模块，张道航负责图书模块，方嘉庆负责商城模块。纵向分工使每名成员能够对一个业务领域形成完整认识，同时也要求小组共同解决账号、权限、通信协议、数据库和统一界面等横向问题。</w:t>
+        <w:t>通信、数据库管理、团队协作和规范化文档。我们据此将工作划分为用户、选课、学籍、图书和商城五</w:t>
+      </w:r>
+      <w:proofErr w:type="gramStart"/>
+      <w:r>
+        <w:t>个</w:t>
+      </w:r>
+      <w:proofErr w:type="gramEnd"/>
+      <w:r>
+        <w:t>纵向业务模块：梁灏才负责用户模块并承担组长工作，刘宇帆负责选课模块，郭昀坤负责学籍模块，</w:t>
+      </w:r>
+      <w:proofErr w:type="gramStart"/>
+      <w:r>
+        <w:t>张道航负责</w:t>
+      </w:r>
+      <w:proofErr w:type="gramEnd"/>
+      <w:r>
+        <w:t>图书模块，方嘉庆负责商城模块。纵向分工使每名成员能够对一个业务领域形成完整认识，同时也要求小组共同解决账号、权限、通信协议、数据库和统一界面等横向问题。</w:t>
       </w:r>
     </w:p>
     <w:p>
@@ -1135,7 +1175,15 @@
         <w:t>”</w:t>
       </w:r>
       <w:r>
-        <w:t>。因此，本报告重点总结需求如何演变、架构与协作方式如何支撑整合、关键技术问题如何被处理，以及当前版本仍有哪些需要继续治理的不足。报告不重复罗列系统菜单，也不逐段解释源代码，而是从小组项目实施过程出发，对设计取舍、质量保障和团队经验进行复盘。</w:t>
+        <w:t>。因此，本报告重点总结需求如何演变、架构与协作方式如何支撑整合、关键技术问题如何被处理，以及当前版本仍有哪些需要继续治理的不足。报告不重复罗列系统菜单，也</w:t>
+      </w:r>
+      <w:proofErr w:type="gramStart"/>
+      <w:r>
+        <w:t>不逐段解释</w:t>
+      </w:r>
+      <w:proofErr w:type="gramEnd"/>
+      <w:r>
+        <w:t>源代码，而是从小组项目实施过程出发，对设计取舍、质量保障和团队经验进行复盘。</w:t>
       </w:r>
     </w:p>
     <w:p>
@@ -1151,9 +1199,11 @@
       <w:pPr>
         <w:pStyle w:val="aa"/>
       </w:pPr>
+      <w:proofErr w:type="gramStart"/>
       <w:r>
         <w:t>一</w:t>
       </w:r>
+      <w:proofErr w:type="gramEnd"/>
       <w:r>
         <w:t xml:space="preserve"> </w:t>
       </w:r>
@@ -1190,7 +1240,15 @@
         <w:t xml:space="preserve"> Socket </w:t>
       </w:r>
       <w:r>
-        <w:t>完成网络通信。除功能要求外，课程还要求使用包组织代码、提供必要文档注释、控制单个</w:t>
+        <w:t>完成网络通信。</w:t>
+      </w:r>
+      <w:proofErr w:type="gramStart"/>
+      <w:r>
+        <w:t>除功能</w:t>
+      </w:r>
+      <w:proofErr w:type="gramEnd"/>
+      <w:r>
+        <w:t>要求外，课程还要求使用包组织代码、提供必要文档注释、控制单个</w:t>
       </w:r>
       <w:r>
         <w:t xml:space="preserve"> Java </w:t>
@@ -1204,7 +1262,31 @@
         <w:pStyle w:val="ab"/>
       </w:pPr>
       <w:r>
-        <w:t>这些约束决定了项目不能以单机脚本或单模块演示为目标。客户端需要为学生、教师、管理员等不同角色提供入口；服务端需要同时处理多个连接并统一执行业务规则；公共模块需要承载客户端和服务端共同使用的消息、命令和数据对象；数据库既要保存业务数据，也要能够随发行包一起交付和重建。项目需求从一开始就同时包含功能正确性、工程组织、协同开发和可交付性四个方面。</w:t>
+        <w:t>这些约束决定了项目不能以单机脚本或单模块演示为目标。客户端需要为学生、教师、管理员等不同角色提供入口；服务</w:t>
+      </w:r>
+      <w:proofErr w:type="gramStart"/>
+      <w:r>
+        <w:t>端需要</w:t>
+      </w:r>
+      <w:proofErr w:type="gramEnd"/>
+      <w:r>
+        <w:t>同时处理多个连接并统一执行业务规则；公共模块需要承载客户端和服务</w:t>
+      </w:r>
+      <w:proofErr w:type="gramStart"/>
+      <w:r>
+        <w:t>端共同</w:t>
+      </w:r>
+      <w:proofErr w:type="gramEnd"/>
+      <w:r>
+        <w:t>使用的消息、命令和数据对象；数据库既要保存业务数据，也要能够随发行包一起交付和重建。项目需求从一开始就同时包含功能正确性、工程组织、协同开发和</w:t>
+      </w:r>
+      <w:proofErr w:type="gramStart"/>
+      <w:r>
+        <w:t>可</w:t>
+      </w:r>
+      <w:proofErr w:type="gramEnd"/>
+      <w:r>
+        <w:t>交付性四个方面。</w:t>
       </w:r>
     </w:p>
     <w:p>
@@ -1226,7 +1308,15 @@
         <w:pStyle w:val="ab"/>
       </w:pPr>
       <w:r>
-        <w:t>用户模块由登录、登出、注册和授权等基本功能，逐步扩展到首次登录强制改密、密码可见性控制、连续失败锁定、会话替换、学生与教师密码重置、账号停用以及安全审计。权限也不再是简单的</w:t>
+        <w:t>用户模块由登录、登出、注册和授权等基本功能，逐步扩展</w:t>
+      </w:r>
+      <w:proofErr w:type="gramStart"/>
+      <w:r>
+        <w:t>到首次</w:t>
+      </w:r>
+      <w:proofErr w:type="gramEnd"/>
+      <w:r>
+        <w:t>登录强制改密、密码可见性控制、连续失败锁定、会话替换、学生与教师密码重置、账号停用以及安全审计。权限也不再是简单的</w:t>
       </w:r>
       <w:r>
         <w:t>“</w:t>
@@ -1254,7 +1344,15 @@
         <w:pStyle w:val="ab"/>
       </w:pPr>
       <w:r>
-        <w:t>选课模块从课程查询、选课、退课和成绩查询，逐步形成包含学期与选课阶段、课程目录、教学班、培养方案、先修关系、课表冲突、课程容量、正常选课配额、重修配额和管理员调课的完整链路。学生可选课程不能只根据课程是否开放判断，还要结合专业、入学年级、培养方案所在学年学期、历史成绩和当前选课阶段综合计算。</w:t>
+        <w:t>选课模块从课程查询、选课、</w:t>
+      </w:r>
+      <w:proofErr w:type="gramStart"/>
+      <w:r>
+        <w:t>退课和</w:t>
+      </w:r>
+      <w:proofErr w:type="gramEnd"/>
+      <w:r>
+        <w:t>成绩查询，逐步形成包含学期与选课阶段、课程目录、教学班、培养方案、先修关系、课表冲突、课程容量、正常选课配额、重修配额和管理员调课的完整链路。学生可选课程不能只根据课程是否开放判断，还要结合专业、入学年级、培养方案所在学年学期、历史成绩和当前选课阶段综合计算。</w:t>
       </w:r>
     </w:p>
     <w:p>
@@ -1325,13 +1423,37 @@
         <w:pStyle w:val="ab"/>
       </w:pPr>
       <w:r>
-        <w:t>最终交付还要求其他成员或教师能够在新环境中稳定复现。为此，项目增加了统一配置、启动脚本、测试账号说明、数据库重置流程和可运行</w:t>
+        <w:t>最终交付还要求其他成员或教师能够在新环境中稳定复现。为此，项目增加了统一配置、启动脚本、测试账号说明、数据库重置流程和</w:t>
+      </w:r>
+      <w:proofErr w:type="gramStart"/>
+      <w:r>
+        <w:t>可</w:t>
+      </w:r>
+      <w:proofErr w:type="gramEnd"/>
+      <w:r>
+        <w:t>运行</w:t>
       </w:r>
       <w:r>
         <w:t xml:space="preserve"> JAR </w:t>
       </w:r>
       <w:r>
-        <w:t>的要求。发行数据库需要同时覆盖管理员、教师、普通学生、首次改密学生、店主和买家等演示角色；启动失败时应提供可定位的信息；客户端和服务端必须使用一致的端口、协议版本和数据文件。需求因此从开发功能进一步延伸到部署、演示和验收保障。</w:t>
+        <w:t>的要求。发行数据库需要同时覆盖管理员、教师、普通学生、</w:t>
+      </w:r>
+      <w:proofErr w:type="gramStart"/>
+      <w:r>
+        <w:t>首次改密学生</w:t>
+      </w:r>
+      <w:proofErr w:type="gramEnd"/>
+      <w:r>
+        <w:t>、店主和买家等演示角色；启动失败时应提供可定位的信息；客户端和服务</w:t>
+      </w:r>
+      <w:proofErr w:type="gramStart"/>
+      <w:r>
+        <w:t>端必须</w:t>
+      </w:r>
+      <w:proofErr w:type="gramEnd"/>
+      <w:r>
+        <w:t>使用一致的端口、协议版本和数据文件。需求因此从开发功能进一步延伸到部署、演示和验收保障。</w:t>
       </w:r>
     </w:p>
     <w:p>
@@ -1347,9 +1469,11 @@
       <w:pPr>
         <w:pStyle w:val="aa"/>
       </w:pPr>
+      <w:proofErr w:type="gramStart"/>
       <w:r>
         <w:t>一</w:t>
       </w:r>
+      <w:proofErr w:type="gramEnd"/>
       <w:r>
         <w:t xml:space="preserve"> </w:t>
       </w:r>
@@ -1384,8 +1508,13 @@
       <w:r>
         <w:t xml:space="preserve">-common </w:t>
       </w:r>
-      <w:r>
-        <w:t>定义跨端共享的协议、命令、查询条件、结果视图及基础类型；</w:t>
+      <w:proofErr w:type="gramStart"/>
+      <w:r>
+        <w:t>定义跨端共享</w:t>
+      </w:r>
+      <w:proofErr w:type="gramEnd"/>
+      <w:r>
+        <w:t>的协议、命令、查询条件、结果视图及基础类型；</w:t>
       </w:r>
       <w:proofErr w:type="spellStart"/>
       <w:r>
@@ -1461,7 +1590,15 @@
         <w:t xml:space="preserve"> Socket </w:t>
       </w:r>
       <w:r>
-        <w:t>发送到服务端。服务端根据请求类型分派到对应处理器，在业务服务中完成权限校验和规则判断，再通过仓储访问数据库，最后返回不暴露</w:t>
+        <w:t>发送到服务端。服务</w:t>
+      </w:r>
+      <w:proofErr w:type="gramStart"/>
+      <w:r>
+        <w:t>端根据</w:t>
+      </w:r>
+      <w:proofErr w:type="gramEnd"/>
+      <w:r>
+        <w:t>请求类型分派到对应处理器，在业务服务中完成权限校验和规则判断，再通过仓储访问数据库，最后返回不暴露</w:t>
       </w:r>
       <w:r>
         <w:t xml:space="preserve"> SQL</w:t>
@@ -1495,7 +1632,15 @@
         <w:t xml:space="preserve"> common </w:t>
       </w:r>
       <w:r>
-        <w:t>模块，把登录会话和权限决策集中到服务端，并通过窄接口完成跨模块访问。例如，选课模块需要培养方案数据时，不再维护第二套课程体系，而是通过仓储端口读取学籍模块使用的规范培养方案表。</w:t>
+        <w:t>模块，把登录会话和权限决策集中到服务端，并通过</w:t>
+      </w:r>
+      <w:proofErr w:type="gramStart"/>
+      <w:r>
+        <w:t>窄</w:t>
+      </w:r>
+      <w:proofErr w:type="gramEnd"/>
+      <w:r>
+        <w:t>接口完成跨模块访问。例如，选课模块需要培养方案数据时，不再维护第二套课程体系，而是通过仓储端口读取学籍模块使用的规范培养方案表。</w:t>
       </w:r>
     </w:p>
     <w:p>
@@ -1554,8 +1699,13 @@
       <w:r>
         <w:t xml:space="preserve"> 1172 </w:t>
       </w:r>
-      <w:r>
-        <w:t>个用户、</w:t>
+      <w:proofErr w:type="gramStart"/>
+      <w:r>
+        <w:t>个</w:t>
+      </w:r>
+      <w:proofErr w:type="gramEnd"/>
+      <w:r>
+        <w:t>用户、</w:t>
       </w:r>
       <w:r>
         <w:t xml:space="preserve">1105 </w:t>
@@ -1566,26 +1716,46 @@
       <w:r>
         <w:t xml:space="preserve">9 </w:t>
       </w:r>
-      <w:r>
-        <w:t>个院系、</w:t>
+      <w:proofErr w:type="gramStart"/>
+      <w:r>
+        <w:t>个</w:t>
+      </w:r>
+      <w:proofErr w:type="gramEnd"/>
+      <w:r>
+        <w:t>院系、</w:t>
       </w:r>
       <w:r>
         <w:t xml:space="preserve">15 </w:t>
       </w:r>
-      <w:r>
-        <w:t>个专业、</w:t>
+      <w:proofErr w:type="gramStart"/>
+      <w:r>
+        <w:t>个</w:t>
+      </w:r>
+      <w:proofErr w:type="gramEnd"/>
+      <w:r>
+        <w:t>专业、</w:t>
       </w:r>
       <w:r>
         <w:t xml:space="preserve">51 </w:t>
       </w:r>
-      <w:r>
-        <w:t>个班级、</w:t>
+      <w:proofErr w:type="gramStart"/>
+      <w:r>
+        <w:t>个</w:t>
+      </w:r>
+      <w:proofErr w:type="gramEnd"/>
+      <w:r>
+        <w:t>班级、</w:t>
       </w:r>
       <w:r>
         <w:t xml:space="preserve">5 </w:t>
       </w:r>
-      <w:r>
-        <w:t>个学期、</w:t>
+      <w:proofErr w:type="gramStart"/>
+      <w:r>
+        <w:t>个</w:t>
+      </w:r>
+      <w:proofErr w:type="gramEnd"/>
+      <w:r>
+        <w:t>学期、</w:t>
       </w:r>
       <w:r>
         <w:t xml:space="preserve">122 </w:t>
@@ -1596,20 +1766,35 @@
       <w:r>
         <w:t xml:space="preserve">292 </w:t>
       </w:r>
-      <w:r>
-        <w:t>个教学班、</w:t>
+      <w:proofErr w:type="gramStart"/>
+      <w:r>
+        <w:t>个</w:t>
+      </w:r>
+      <w:proofErr w:type="gramEnd"/>
+      <w:r>
+        <w:t>教学班、</w:t>
       </w:r>
       <w:r>
         <w:t xml:space="preserve">41 </w:t>
       </w:r>
-      <w:r>
-        <w:t>套培养方案、</w:t>
+      <w:proofErr w:type="gramStart"/>
+      <w:r>
+        <w:t>套培养</w:t>
+      </w:r>
+      <w:proofErr w:type="gramEnd"/>
+      <w:r>
+        <w:t>方案、</w:t>
       </w:r>
       <w:r>
         <w:t xml:space="preserve">4804 </w:t>
       </w:r>
-      <w:r>
-        <w:t>条方案课程、</w:t>
+      <w:proofErr w:type="gramStart"/>
+      <w:r>
+        <w:t>条方案</w:t>
+      </w:r>
+      <w:proofErr w:type="gramEnd"/>
+      <w:r>
+        <w:t>课程、</w:t>
       </w:r>
       <w:r>
         <w:t xml:space="preserve">320 </w:t>
@@ -1632,8 +1817,21 @@
       <w:r>
         <w:t xml:space="preserve"> 10 </w:t>
       </w:r>
-      <w:r>
-        <w:t>个专业和四个年级，并同时关联课程、图书和商城场景。这些数据不仅用于展示规模，更用于发现关联缺失、容量不一致、库存或金额错误等问题。</w:t>
+      <w:proofErr w:type="gramStart"/>
+      <w:r>
+        <w:t>个</w:t>
+      </w:r>
+      <w:proofErr w:type="gramEnd"/>
+      <w:r>
+        <w:t>专业和四个年级，并同时关联课程、图书和商城场景。这些数据不仅用于展示规模，</w:t>
+      </w:r>
+      <w:proofErr w:type="gramStart"/>
+      <w:r>
+        <w:t>更用于</w:t>
+      </w:r>
+      <w:proofErr w:type="gramEnd"/>
+      <w:r>
+        <w:t>发现关联缺失、容量不一致、库存或金额错误等问题。</w:t>
       </w:r>
     </w:p>
     <w:p>
@@ -1695,11 +1893,16 @@
       <w:r>
         <w:t>冒烟测试覆盖客户端</w:t>
       </w:r>
+      <w:proofErr w:type="gramStart"/>
       <w:r>
         <w:t>—</w:t>
       </w:r>
       <w:r>
-        <w:t>服务端请求链路，</w:t>
+        <w:t>服务端</w:t>
+      </w:r>
+      <w:proofErr w:type="gramEnd"/>
+      <w:r>
+        <w:t>请求链路，</w:t>
       </w:r>
       <w:r>
         <w:t xml:space="preserve">Swing </w:t>
@@ -1721,9 +1924,11 @@
       <w:pPr>
         <w:pStyle w:val="aa"/>
       </w:pPr>
+      <w:proofErr w:type="gramStart"/>
       <w:r>
         <w:t>一</w:t>
       </w:r>
+      <w:proofErr w:type="gramEnd"/>
       <w:r>
         <w:t xml:space="preserve"> Socket </w:t>
       </w:r>
@@ -1739,13 +1944,29 @@
         <w:t xml:space="preserve">Socket </w:t>
       </w:r>
       <w:r>
-        <w:t>是客户端和服务端之间的主通信通道。所有跨端对象必须可序列化，且两端依赖同一版本的</w:t>
+        <w:t>是客户端和服务端之间的主通信通道。所有</w:t>
+      </w:r>
+      <w:proofErr w:type="gramStart"/>
+      <w:r>
+        <w:t>跨端对象</w:t>
+      </w:r>
+      <w:proofErr w:type="gramEnd"/>
+      <w:r>
+        <w:t>必须可序列化，且两端依赖同一版本的</w:t>
       </w:r>
       <w:r>
         <w:t xml:space="preserve"> common </w:t>
       </w:r>
       <w:r>
-        <w:t>模块。系统将请求意图、参数和返回结果定义为明确的数据对象，避免把界面组件或数据库实体直接暴露到网络边界。统一协议使不同模块可以共享连接、错误处理和会话信息，也减少了客户端与服务端因字段不一致产生的运行时错误。</w:t>
+        <w:t>模块。系统将请求意图、参数和返回结果定义为明确的数据对象，避免把界面组件或数据库实体直接暴露到网络边界。统一协议使不同模块可以共享连接、错误处理和会话信息，也减少了客户端与</w:t>
+      </w:r>
+      <w:proofErr w:type="gramStart"/>
+      <w:r>
+        <w:t>服务端因字段</w:t>
+      </w:r>
+      <w:proofErr w:type="gramEnd"/>
+      <w:r>
+        <w:t>不一致产生的运行时错误。</w:t>
       </w:r>
     </w:p>
     <w:p>
@@ -1811,7 +2032,15 @@
         <w:pStyle w:val="ab"/>
       </w:pPr>
       <w:r>
-        <w:t>选课容量、重修配额、商品库存、购物车数量、订单金额、借阅状态等数据会被多个客户端同时修改。若先查询再无条件写入，两个请求可能同时通过检查而造成超额选</w:t>
+        <w:t>选课容量、重修配额、商品库存、购物车数量、订单金额、借阅状态等数据会被多个客户端同时修改。若先</w:t>
+      </w:r>
+      <w:proofErr w:type="gramStart"/>
+      <w:r>
+        <w:t>查询再</w:t>
+      </w:r>
+      <w:proofErr w:type="gramEnd"/>
+      <w:r>
+        <w:t>无条件写入，两个请求可能同时通过检查而造成超额选</w:t>
       </w:r>
       <w:r>
         <w:lastRenderedPageBreak/>
@@ -1889,7 +2118,15 @@
         <w:pStyle w:val="ab"/>
       </w:pPr>
       <w:r>
-        <w:t>在此基础上，服务端还需要检查选课阶段、先修课程、时间冲突、重复选课、教学班容量以及正常与重修配额。退课后容量必须恢复，管理员调课也不能绕过关键约束。通过把规则组合集中在服务层，并以仓储端口读取规范数据，项目避免了客户端各自计算或模块间复制课程数据所导致的不一致。</w:t>
+        <w:t>在此基础上，</w:t>
+      </w:r>
+      <w:proofErr w:type="gramStart"/>
+      <w:r>
+        <w:t>服务端还需要</w:t>
+      </w:r>
+      <w:proofErr w:type="gramEnd"/>
+      <w:r>
+        <w:t>检查选课阶段、先修课程、时间冲突、重复选课、教学班容量以及正常与重修配额。退课后容量必须恢复，管理员调课也不能绕过关键约束。通过把规则组合集中在服务层，并以仓储端口读取规范数据，项目避免了客户端各自计算或模块间复制课程数据所导致的不一致。</w:t>
       </w:r>
     </w:p>
     <w:p>
@@ -1923,8 +2160,13 @@
         <w:t xml:space="preserve">Access </w:t>
       </w:r>
       <w:r>
-        <w:t>数据集完成</w:t>
-      </w:r>
+        <w:t>数据</w:t>
+      </w:r>
+      <w:proofErr w:type="gramStart"/>
+      <w:r>
+        <w:t>集完成</w:t>
+      </w:r>
+      <w:proofErr w:type="gramEnd"/>
       <w:r>
         <w:t xml:space="preserve"> 8110 </w:t>
       </w:r>
@@ -1977,7 +2219,15 @@
         <w:t xml:space="preserve"> 18 </w:t>
       </w:r>
       <w:r>
-        <w:t>项客户端测试按既有条件跳过。</w:t>
+        <w:t>项客户端</w:t>
+      </w:r>
+      <w:proofErr w:type="gramStart"/>
+      <w:r>
+        <w:t>测试按</w:t>
+      </w:r>
+      <w:proofErr w:type="gramEnd"/>
+      <w:r>
+        <w:t>既有条件跳过。</w:t>
       </w:r>
     </w:p>
     <w:p>
@@ -2019,9 +2269,11 @@
       <w:pPr>
         <w:pStyle w:val="aa"/>
       </w:pPr>
+      <w:proofErr w:type="gramStart"/>
       <w:r>
         <w:t>一</w:t>
       </w:r>
+      <w:proofErr w:type="gramEnd"/>
       <w:r>
         <w:t xml:space="preserve"> </w:t>
       </w:r>
@@ -2060,7 +2312,15 @@
         <w:t>”</w:t>
       </w:r>
       <w:r>
-        <w:t>判断完成度。真正影响交付质量的是接口是否统一、权限是否在服务端生效、数据库是否保持一致、并发操作是否安全、测试是否能够复现、其他成员是否能按说明启动。我们在后期将注意力从单模块完成转向统一基线和全链路验证，对软件工程中的边界、依赖和质量保障形成了更具体的认识。</w:t>
+        <w:t>判断完成度。真正影响交付质量的是接口是否统一、权限是否在服务端生效、数据库是否保持一致、并发操作是否安全、测试是否能够复现、其他成员是否能按说明启动。我们在后期将注意力从单模</w:t>
+      </w:r>
+      <w:proofErr w:type="gramStart"/>
+      <w:r>
+        <w:t>块完成</w:t>
+      </w:r>
+      <w:proofErr w:type="gramEnd"/>
+      <w:r>
+        <w:t>转向统一基线和全链路验证，对软件工程中的边界、依赖和质量保障形成了更具体的认识。</w:t>
       </w:r>
     </w:p>
     <w:p>
@@ -2082,7 +2342,15 @@
         <w:pStyle w:val="ab"/>
       </w:pPr>
       <w:r>
-        <w:t>统一界面的视觉一致性仍需改进。人工测试曾指出商城与其他模块的颜色、间距、表格、按钮和交互反馈差异明显，部分页面在状态变化后不能立即切换。店铺注销和跨品类上架等需求也尚未完全确认。后续需要先建立全软件页面和公共组件清单，确认统一视觉方案，再逐模块整改，并同步验证服务端能力与界面状态。</w:t>
+        <w:t>统一界面的视觉一致性仍需改进。人工测试曾指出商城与其他模块的颜色、间距、表格、按钮和交互反馈差异明显，部分页面在状态变化后不能立即切换。店铺注销和跨品类上架等需求也尚未完全确认。后续需要先建立全软件页面和公共组件清单，确认统一视觉方案，再逐模块整改，并同步验证服务</w:t>
+      </w:r>
+      <w:proofErr w:type="gramStart"/>
+      <w:r>
+        <w:t>端能力</w:t>
+      </w:r>
+      <w:proofErr w:type="gramEnd"/>
+      <w:r>
+        <w:t>与界面状态。</w:t>
       </w:r>
     </w:p>
     <w:p>
@@ -2096,7 +2364,23 @@
         <w:t xml:space="preserve">Access </w:t>
       </w:r>
       <w:r>
-        <w:t>是文件数据库，适合课程项目本地运行和随包交付，但不适合多个服务端实例直接共享同一个文件。当前由每位成员在本机运行服务端和数据库更便于调试；若以后部署唯一远程服务端，必须同时明确单写入实例、数据库备份、迁移与回滚、端口与防火墙、日志轮转及密码更换。课程演示账号的统一初始密码不能用于公开环境。</w:t>
+        <w:t>是文件数据库，适合课程</w:t>
+      </w:r>
+      <w:proofErr w:type="gramStart"/>
+      <w:r>
+        <w:t>项目本地</w:t>
+      </w:r>
+      <w:proofErr w:type="gramEnd"/>
+      <w:r>
+        <w:t>运行和随包交付，但不适合多个服务端实例直接共享同一个文件。当前由每位成员在本机运行服务端和数据库更便于调试；若以后部署唯一远程服务端，必须同时</w:t>
+      </w:r>
+      <w:proofErr w:type="gramStart"/>
+      <w:r>
+        <w:t>明确单</w:t>
+      </w:r>
+      <w:proofErr w:type="gramEnd"/>
+      <w:r>
+        <w:t>写入实例、数据库备份、迁移与回滚、端口与防火墙、日志轮转及密码更换。课程演示账号的统一初始密码不能用于公开环境。</w:t>
       </w:r>
     </w:p>
     <w:p>
@@ -2146,11 +2430,16 @@
       <w:r>
         <w:t>沟通还需要围绕跨模块业务链路进行，而不能只按成员边界汇报。例如培养方案</w:t>
       </w:r>
+      <w:proofErr w:type="gramStart"/>
       <w:r>
         <w:t>—</w:t>
       </w:r>
       <w:r>
-        <w:t>学生资格</w:t>
+        <w:t>学生</w:t>
+      </w:r>
+      <w:proofErr w:type="gramEnd"/>
+      <w:r>
+        <w:t>资格</w:t>
       </w:r>
       <w:r>
         <w:t>—</w:t>
@@ -2208,7 +2497,15 @@
         <w:pStyle w:val="ab"/>
       </w:pPr>
       <w:r>
-        <w:t>通过本项目，我们认识到分层设计的核心不是目录数量，而是依赖方向和职责边界。界面负责展示与交互，服务负责可信的业务判断，仓储负责数据访问，协议负责跨进程表达意图。只有边界清晰，模块才能独立测试和替换；如果界面直接拼接</w:t>
+        <w:t>通过本项目，我们认识到分层设计的核心不是目录数量，而是依赖方向和职责边界。界面负责展示与交互，服务负责可信的业务判断，仓储负责数据访问，协议负责跨进</w:t>
+      </w:r>
+      <w:proofErr w:type="gramStart"/>
+      <w:r>
+        <w:t>程表达</w:t>
+      </w:r>
+      <w:proofErr w:type="gramEnd"/>
+      <w:r>
+        <w:t>意图。只有边界清晰，模块才能独立测试和替换；如果界面直接拼接</w:t>
       </w:r>
       <w:r>
         <w:t xml:space="preserve"> SQL</w:t>
@@ -2246,7 +2543,15 @@
         <w:t>”</w:t>
       </w:r>
       <w:r>
-        <w:t>的含义。按钮禁用、表单校验只能改善体验，不能代替服务端授权；写操作开始前读取到的容量或库存，在真正更新时可能已经改变，因此必须在同一事务和锁顺序中重新检查。并发正确性、会话失效和请求去重不是大型互联网系统才需要考虑的问题，在多个本地客户端连接同一服务端时同样会出现。</w:t>
+        <w:t>的含义。按钮禁用、表单校验只能改善体验，不能代替服务端授权；写操作开始前读取到的容量或库存，在真正更新时可能已经改变，因此必须在同一事务和锁顺序中重新检查。并发正确性、会话失效和请求去</w:t>
+      </w:r>
+      <w:proofErr w:type="gramStart"/>
+      <w:r>
+        <w:t>重不是</w:t>
+      </w:r>
+      <w:proofErr w:type="gramEnd"/>
+      <w:r>
+        <w:t>大型互联网系统才需要考虑的问题，在多个本地客户端连接同一服务端时同样会出现。</w:t>
       </w:r>
     </w:p>
     <w:p>
@@ -2254,7 +2559,23 @@
         <w:pStyle w:val="ab"/>
       </w:pPr>
       <w:r>
-        <w:t>最后，测试和交付本身也是设计的一部分。测试数据必须覆盖角色、年级、专业和异常场景，自动化测试必须与真实数据库和网络冒烟互相补充，运行包必须能从干净环境启动。一个功能只有在代码、数据、配置、文档和演示流程保持一致时才算真正完成。后续若继续迭代，我们会优先偿还高风险的大文件和文档缺口，统一界面体验，并在接口冻结后完善部署与回滚机制。</w:t>
+        <w:t>最后，测试和交付本身也是设计的一部分。测试数据必须覆盖角色、年级、专业和异常场景，自动化测试必须与真实数据库和网络冒烟互相补充，运行包必须能从干净环境启动。一个功能只有在代码、数据、配置、文档和演示流程保持一致时才算真正完成。后续若继续迭代，我们会优先</w:t>
+      </w:r>
+      <w:proofErr w:type="gramStart"/>
+      <w:r>
+        <w:t>偿还高</w:t>
+      </w:r>
+      <w:proofErr w:type="gramEnd"/>
+      <w:r>
+        <w:t>风险的大文件和文档缺口，统一界面体验，并在接口冻结后完善部署</w:t>
+      </w:r>
+      <w:proofErr w:type="gramStart"/>
+      <w:r>
+        <w:t>与回滚机制</w:t>
+      </w:r>
+      <w:proofErr w:type="gramEnd"/>
+      <w:r>
+        <w:t>。</w:t>
       </w:r>
     </w:p>
     <w:p>
@@ -2262,6 +2583,9 @@
         <w:pStyle w:val="aa"/>
       </w:pPr>
       <w:r>
+        <w:rPr>
+          <w:noProof/>
+        </w:rPr>
         <w:lastRenderedPageBreak/>
         <mc:AlternateContent>
           <mc:Choice Requires="wps">
@@ -2523,7 +2847,39 @@
                                 <w:rFonts w:ascii="宋体" w:eastAsia="宋体" w:hAnsi="宋体"/>
                                 <w:lang w:eastAsia="zh-CN"/>
                               </w:rPr>
-                              <w:t xml:space="preserve">本人主要负责课程选课模块的设计、开发与后续完善，完成统一选课阶段管理、学生选课/退课/补选/重修等核心流程，并参与培养方案课程筛选、教学班容量管理、时间冲突校验及并发选课控制等功能实现。同时，我承担了部分多模块合并工作，协助统一客户端主界面、服务端消息路由、权限配置、数据库初始化和运行入口，保证课程模块能够接入 </w:t>
+                              <w:t>本人主要负责课程选课模块的设计、开发与后续完善，完成统一选课阶段管理、学生选课/</w:t>
+                            </w:r>
+                            <w:proofErr w:type="gramStart"/>
+                            <w:r>
+                              <w:rPr>
+                                <w:rFonts w:ascii="宋体" w:eastAsia="宋体" w:hAnsi="宋体"/>
+                                <w:lang w:eastAsia="zh-CN"/>
+                              </w:rPr>
+                              <w:t>退课</w:t>
+                            </w:r>
+                            <w:proofErr w:type="gramEnd"/>
+                            <w:r>
+                              <w:rPr>
+                                <w:rFonts w:ascii="宋体" w:eastAsia="宋体" w:hAnsi="宋体"/>
+                                <w:lang w:eastAsia="zh-CN"/>
+                              </w:rPr>
+                              <w:t>/补选/重修等核心流程，并参与培养方案课程筛选、教学班容量管理、时间冲突校验及并发选课控制等功能实现。同时，我承担了部分多模块合并工作，协助统一客户端主界面、服务</w:t>
+                            </w:r>
+                            <w:proofErr w:type="gramStart"/>
+                            <w:r>
+                              <w:rPr>
+                                <w:rFonts w:ascii="宋体" w:eastAsia="宋体" w:hAnsi="宋体"/>
+                                <w:lang w:eastAsia="zh-CN"/>
+                              </w:rPr>
+                              <w:t>端消息</w:t>
+                            </w:r>
+                            <w:proofErr w:type="gramEnd"/>
+                            <w:r>
+                              <w:rPr>
+                                <w:rFonts w:ascii="宋体" w:eastAsia="宋体" w:hAnsi="宋体"/>
+                                <w:lang w:eastAsia="zh-CN"/>
+                              </w:rPr>
+                              <w:t xml:space="preserve">路由、权限配置、数据库初始化和运行入口，保证课程模块能够接入 </w:t>
                             </w:r>
                             <w:proofErr w:type="spellStart"/>
                             <w:r>
@@ -2620,7 +2976,51 @@
                                 <w:szCs w:val="22"/>
                                 <w:lang w:eastAsia="zh-CN"/>
                               </w:rPr>
-                              <w:t>我完成了课程选课模块的主要功能开发。学生端将普通选课、退改补和重修整合到统一选课页面，能够根据当前开放的选课阶段、学生学籍状态、历史修读情况、培养方案和教学班容量，展示可执行的选课操作及不可选原因。管理员端实现了选课阶段的创建、编辑、开放和关闭，并通过状态限制和版本校验避免阶段状态冲突。</w:t>
+                              <w:t>我完成了课程选课模块的主要功能开发。学生端将普通选课、退改补和重修整合到统一选课页面，能够根据当前开放的选课阶段、学生学籍状态、历史修读情况、培养方案和教学班容量，展示可执行的选课操作及</w:t>
+                            </w:r>
+                            <w:proofErr w:type="gramStart"/>
+                            <w:r>
+                              <w:rPr>
+                                <w:rFonts w:ascii="宋体" w:eastAsia="宋体" w:hAnsi="宋体" w:hint="eastAsia"/>
+                                <w:bCs/>
+                                <w:color w:val="000000"/>
+                                <w:szCs w:val="22"/>
+                                <w:lang w:eastAsia="zh-CN"/>
+                              </w:rPr>
+                              <w:t>不</w:t>
+                            </w:r>
+                            <w:proofErr w:type="gramEnd"/>
+                            <w:r>
+                              <w:rPr>
+                                <w:rFonts w:ascii="宋体" w:eastAsia="宋体" w:hAnsi="宋体" w:hint="eastAsia"/>
+                                <w:bCs/>
+                                <w:color w:val="000000"/>
+                                <w:szCs w:val="22"/>
+                                <w:lang w:eastAsia="zh-CN"/>
+                              </w:rPr>
+                              <w:t>可选原因。管理员</w:t>
+                            </w:r>
+                            <w:proofErr w:type="gramStart"/>
+                            <w:r>
+                              <w:rPr>
+                                <w:rFonts w:ascii="宋体" w:eastAsia="宋体" w:hAnsi="宋体" w:hint="eastAsia"/>
+                                <w:bCs/>
+                                <w:color w:val="000000"/>
+                                <w:szCs w:val="22"/>
+                                <w:lang w:eastAsia="zh-CN"/>
+                              </w:rPr>
+                              <w:t>端实现</w:t>
+                            </w:r>
+                            <w:proofErr w:type="gramEnd"/>
+                            <w:r>
+                              <w:rPr>
+                                <w:rFonts w:ascii="宋体" w:eastAsia="宋体" w:hAnsi="宋体" w:hint="eastAsia"/>
+                                <w:bCs/>
+                                <w:color w:val="000000"/>
+                                <w:szCs w:val="22"/>
+                                <w:lang w:eastAsia="zh-CN"/>
+                              </w:rPr>
+                              <w:t>了选课阶段的创建、编辑、开放和关闭，并通过状态限制和版本校验避免阶段状态冲突。</w:t>
                             </w:r>
                           </w:p>
                           <w:p>
@@ -2642,7 +3042,51 @@
                                 <w:szCs w:val="22"/>
                                 <w:lang w:eastAsia="zh-CN"/>
                               </w:rPr>
-                              <w:t>在业务规则方面，实现了按学生培养方案和学期筛选课程、隐藏已通过或尚未到学习阶段的课程、区分普通选课与重修选课容量、检查时间冲突和重复选课等逻辑；关键写操作会在服务端再次校验，并通过事务和锁保证并发情况下容量数据正确。客户端也完成了课程展开、教学班选择、选课状态提示、取消选课与页面刷新等交互。</w:t>
+                              <w:t>在业务规则方面，实现了按学生培养方案和学期筛选课程、隐藏已通过或尚未到学习阶段的课程、区分普通选课与重修选课容量、检查时间冲突和重复选课等逻辑；关键写操作会在服务</w:t>
+                            </w:r>
+                            <w:proofErr w:type="gramStart"/>
+                            <w:r>
+                              <w:rPr>
+                                <w:rFonts w:ascii="宋体" w:eastAsia="宋体" w:hAnsi="宋体" w:hint="eastAsia"/>
+                                <w:bCs/>
+                                <w:color w:val="000000"/>
+                                <w:szCs w:val="22"/>
+                                <w:lang w:eastAsia="zh-CN"/>
+                              </w:rPr>
+                              <w:t>端再次</w:t>
+                            </w:r>
+                            <w:proofErr w:type="gramEnd"/>
+                            <w:r>
+                              <w:rPr>
+                                <w:rFonts w:ascii="宋体" w:eastAsia="宋体" w:hAnsi="宋体" w:hint="eastAsia"/>
+                                <w:bCs/>
+                                <w:color w:val="000000"/>
+                                <w:szCs w:val="22"/>
+                                <w:lang w:eastAsia="zh-CN"/>
+                              </w:rPr>
+                              <w:t>校验，并通过事务和</w:t>
+                            </w:r>
+                            <w:proofErr w:type="gramStart"/>
+                            <w:r>
+                              <w:rPr>
+                                <w:rFonts w:ascii="宋体" w:eastAsia="宋体" w:hAnsi="宋体" w:hint="eastAsia"/>
+                                <w:bCs/>
+                                <w:color w:val="000000"/>
+                                <w:szCs w:val="22"/>
+                                <w:lang w:eastAsia="zh-CN"/>
+                              </w:rPr>
+                              <w:t>锁保证</w:t>
+                            </w:r>
+                            <w:proofErr w:type="gramEnd"/>
+                            <w:r>
+                              <w:rPr>
+                                <w:rFonts w:ascii="宋体" w:eastAsia="宋体" w:hAnsi="宋体" w:hint="eastAsia"/>
+                                <w:bCs/>
+                                <w:color w:val="000000"/>
+                                <w:szCs w:val="22"/>
+                                <w:lang w:eastAsia="zh-CN"/>
+                              </w:rPr>
+                              <w:t>并发情况下容量数据正确。客户端也完成了课程展开、教学班选择、选课状态提示、取消选课与页面刷新等交互。</w:t>
                             </w:r>
                           </w:p>
                           <w:p>
@@ -2696,7 +3140,29 @@
                                 <w:szCs w:val="22"/>
                                 <w:lang w:eastAsia="zh-CN"/>
                               </w:rPr>
-                              <w:t>部分完成了组网连接与联调说明整理，降低了不同设备之间进行服务端联调和演示时的网络配置成本。</w:t>
+                              <w:t>部分完成了组网连接与联调说明整理，降低了不同设备之间进行</w:t>
+                            </w:r>
+                            <w:proofErr w:type="gramStart"/>
+                            <w:r>
+                              <w:rPr>
+                                <w:rFonts w:ascii="宋体" w:eastAsia="宋体" w:hAnsi="宋体" w:hint="eastAsia"/>
+                                <w:bCs/>
+                                <w:color w:val="000000"/>
+                                <w:szCs w:val="22"/>
+                                <w:lang w:eastAsia="zh-CN"/>
+                              </w:rPr>
+                              <w:t>服务端联调和</w:t>
+                            </w:r>
+                            <w:proofErr w:type="gramEnd"/>
+                            <w:r>
+                              <w:rPr>
+                                <w:rFonts w:ascii="宋体" w:eastAsia="宋体" w:hAnsi="宋体" w:hint="eastAsia"/>
+                                <w:bCs/>
+                                <w:color w:val="000000"/>
+                                <w:szCs w:val="22"/>
+                                <w:lang w:eastAsia="zh-CN"/>
+                              </w:rPr>
+                              <w:t>演示时的网络配置成本。</w:t>
                             </w:r>
                           </w:p>
                           <w:p>
@@ -2764,7 +3230,29 @@
                                 <w:szCs w:val="22"/>
                                 <w:lang w:eastAsia="zh-CN"/>
                               </w:rPr>
-                              <w:t>本次项目让我更深入地理解了完整业务模块从需求分析、数据模型设计、服务端规则实现、客户端交互，到跨模块集成和部署联调的全过程。选课功能看似是简单的“选”和“退”，但实际涉及培养方案、学期阶段、容量、重修资格、时间冲突及并发控制等多个约束，因此需要将规则放在服务端统一校验，不能只依赖客户端页面限制。</w:t>
+                              <w:t>本次项目让我更深入地理解了完整业务模块从需求分析、数据模型设计、服务端规则实现、客户端交互，到跨模块集成和部署联调的全过程。选课功能看似是简单的“选”和“退”，但实际涉及培养方案、学期阶段、容量、重修资格、时间冲突及并发控制等多个约束，因此需要将规则放在服务</w:t>
+                            </w:r>
+                            <w:proofErr w:type="gramStart"/>
+                            <w:r>
+                              <w:rPr>
+                                <w:rFonts w:ascii="宋体" w:eastAsia="宋体" w:hAnsi="宋体" w:hint="eastAsia"/>
+                                <w:bCs/>
+                                <w:color w:val="000000"/>
+                                <w:szCs w:val="22"/>
+                                <w:lang w:eastAsia="zh-CN"/>
+                              </w:rPr>
+                              <w:t>端统一</w:t>
+                            </w:r>
+                            <w:proofErr w:type="gramEnd"/>
+                            <w:r>
+                              <w:rPr>
+                                <w:rFonts w:ascii="宋体" w:eastAsia="宋体" w:hAnsi="宋体" w:hint="eastAsia"/>
+                                <w:bCs/>
+                                <w:color w:val="000000"/>
+                                <w:szCs w:val="22"/>
+                                <w:lang w:eastAsia="zh-CN"/>
+                              </w:rPr>
+                              <w:t>校验，不能只依赖客户端页面限制。</w:t>
                             </w:r>
                           </w:p>
                           <w:p>
@@ -3607,7 +4095,7 @@
       <w:pPr>
         <w:spacing w:before="0" w:after="0"/>
         <w:rPr>
-          <w:rFonts w:ascii="Arial" w:eastAsia="黑体" w:hAnsi="Arial" w:cstheme="minorBidi" w:hint="eastAsia"/>
+          <w:rFonts w:ascii="Arial" w:eastAsia="黑体" w:hAnsi="Arial" w:cstheme="minorBidi"/>
           <w:b/>
           <w:color w:val="000000"/>
           <w:kern w:val="2"/>
@@ -3924,6 +4412,7 @@
                                 <w:rFonts w:ascii="宋体" w:eastAsia="宋体" w:hAnsi="宋体" w:hint="eastAsia"/>
                                 <w:color w:val="000000"/>
                                 <w:szCs w:val="22"/>
+                                <w:lang w:eastAsia="zh-CN"/>
                               </w:rPr>
                               <w:t>学籍管理模块</w:t>
                             </w:r>
@@ -3935,7 +4424,29 @@
                                 <w:szCs w:val="22"/>
                                 <w:lang w:eastAsia="zh-CN"/>
                               </w:rPr>
-                              <w:t xml:space="preserve">的设计、开发与后续完善，完成院系班级组织架构管理、学籍建立与档案维护、培养方案配置、成绩录入与成绩单查询、以及转专业审批全生命周期流转等核心功能。同时，我承担了全系统的权限体系规范与客户端体验优化工作，梳理并实现了超级管理员、学籍管理员、学院管理员、教师与学生的多级权限隔离与路由导航，推进无模态嵌入式卡片 UI 统一重构，并实现了基于学号直登的账号映射化简。在系统集成与底层支持方面，我参与了全局通信协议制定，负责 </w:t>
+                              <w:t>的设计、开发与后续完善，完成院系班级组织架构管理、学籍建立与档案维护、培养方案配置、成绩录入与成绩单查询、以及转专业</w:t>
+                            </w:r>
+                            <w:proofErr w:type="gramStart"/>
+                            <w:r>
+                              <w:rPr>
+                                <w:rFonts w:ascii="宋体" w:eastAsia="宋体" w:hAnsi="宋体" w:hint="eastAsia"/>
+                                <w:bCs/>
+                                <w:color w:val="000000"/>
+                                <w:szCs w:val="22"/>
+                                <w:lang w:eastAsia="zh-CN"/>
+                              </w:rPr>
+                              <w:t>审批全</w:t>
+                            </w:r>
+                            <w:proofErr w:type="gramEnd"/>
+                            <w:r>
+                              <w:rPr>
+                                <w:rFonts w:ascii="宋体" w:eastAsia="宋体" w:hAnsi="宋体" w:hint="eastAsia"/>
+                                <w:bCs/>
+                                <w:color w:val="000000"/>
+                                <w:szCs w:val="22"/>
+                                <w:lang w:eastAsia="zh-CN"/>
+                              </w:rPr>
+                              <w:t xml:space="preserve">生命周期流转等核心功能。同时，我承担了全系统的权限体系规范与客户端体验优化工作，梳理并实现了超级管理员、学籍管理员、学院管理员、教师与学生的多级权限隔离与路由导航，推进无模态嵌入式卡片 UI 统一重构，并实现了基于学号直登的账号映射化简。在系统集成与底层支持方面，我参与了全局通信协议制定，负责 </w:t>
                             </w:r>
                             <w:proofErr w:type="spellStart"/>
                             <w:r>
@@ -3963,7 +4474,7 @@
                           <w:p>
                             <w:pPr>
                               <w:rPr>
-                                <w:rFonts w:eastAsia="宋体" w:hint="eastAsia"/>
+                                <w:rFonts w:eastAsia="宋体"/>
                                 <w:bCs/>
                                 <w:color w:val="000000"/>
                                 <w:sz w:val="24"/>
@@ -4025,7 +4536,73 @@
                                 <w:szCs w:val="22"/>
                                 <w:lang w:eastAsia="zh-CN"/>
                               </w:rPr>
-                              <w:t>我完成了学籍管理模块与相关子系统的核心功能研发。学生端实现了个人学籍档案在线查询、基本信息修改申请（支持草稿与撤回）、标准学籍证明 PDF 导出、个人培养方案修读进度比对、个人成绩单查询以及转专业志愿填报；管理端实现了学院/专业/班级层级维护、班级批量自动划分、学生档案手动建档与批量导入、培养方案课程导入、学生成绩录入与批量导入，以及转专业批次全流程管理。</w:t>
+                              <w:t>我完成了学籍管理模块与相关子系统的核心功能研发。学生</w:t>
+                            </w:r>
+                            <w:proofErr w:type="gramStart"/>
+                            <w:r>
+                              <w:rPr>
+                                <w:rFonts w:ascii="宋体" w:eastAsia="宋体" w:hAnsi="宋体"/>
+                                <w:bCs/>
+                                <w:color w:val="000000"/>
+                                <w:szCs w:val="22"/>
+                                <w:lang w:eastAsia="zh-CN"/>
+                              </w:rPr>
+                              <w:t>端实现</w:t>
+                            </w:r>
+                            <w:proofErr w:type="gramEnd"/>
+                            <w:r>
+                              <w:rPr>
+                                <w:rFonts w:ascii="宋体" w:eastAsia="宋体" w:hAnsi="宋体"/>
+                                <w:bCs/>
+                                <w:color w:val="000000"/>
+                                <w:szCs w:val="22"/>
+                                <w:lang w:eastAsia="zh-CN"/>
+                              </w:rPr>
+                              <w:t>了个人学籍档案在线查询、基本信息修改申请（支持草稿与撤回）、标准学籍证明 PDF 导出、个人培养方案修读进度比对、个人成绩单查询以及转专业志愿填报；管理</w:t>
+                            </w:r>
+                            <w:proofErr w:type="gramStart"/>
+                            <w:r>
+                              <w:rPr>
+                                <w:rFonts w:ascii="宋体" w:eastAsia="宋体" w:hAnsi="宋体"/>
+                                <w:bCs/>
+                                <w:color w:val="000000"/>
+                                <w:szCs w:val="22"/>
+                                <w:lang w:eastAsia="zh-CN"/>
+                              </w:rPr>
+                              <w:t>端实现</w:t>
+                            </w:r>
+                            <w:proofErr w:type="gramEnd"/>
+                            <w:r>
+                              <w:rPr>
+                                <w:rFonts w:ascii="宋体" w:eastAsia="宋体" w:hAnsi="宋体"/>
+                                <w:bCs/>
+                                <w:color w:val="000000"/>
+                                <w:szCs w:val="22"/>
+                                <w:lang w:eastAsia="zh-CN"/>
+                              </w:rPr>
+                              <w:t>了学院/专业/班级层级维护、班级批量自动划分、学生档案手动建档与批量导入、培养方案课程导入、学生成绩录入与批量导入，以及转专业</w:t>
+                            </w:r>
+                            <w:proofErr w:type="gramStart"/>
+                            <w:r>
+                              <w:rPr>
+                                <w:rFonts w:ascii="宋体" w:eastAsia="宋体" w:hAnsi="宋体"/>
+                                <w:bCs/>
+                                <w:color w:val="000000"/>
+                                <w:szCs w:val="22"/>
+                                <w:lang w:eastAsia="zh-CN"/>
+                              </w:rPr>
+                              <w:t>批次全</w:t>
+                            </w:r>
+                            <w:proofErr w:type="gramEnd"/>
+                            <w:r>
+                              <w:rPr>
+                                <w:rFonts w:ascii="宋体" w:eastAsia="宋体" w:hAnsi="宋体"/>
+                                <w:bCs/>
+                                <w:color w:val="000000"/>
+                                <w:szCs w:val="22"/>
+                                <w:lang w:eastAsia="zh-CN"/>
+                              </w:rPr>
+                              <w:t>流程管理。</w:t>
                             </w:r>
                           </w:p>
                           <w:p>
@@ -4047,7 +4624,29 @@
                                 <w:szCs w:val="22"/>
                                 <w:lang w:eastAsia="zh-CN"/>
                               </w:rPr>
-                              <w:t>在业务规则与状态流转方面，为转专业业务设计并实现了严密的有限状态机，覆盖资格初审、转出学院审核、转入学院考核赋分、拟录取公示与自动执行学籍变更的全链路闭环；针对高并发场景，设计了事务性防碰撞学号生成器；在权限控制上落实了细粒度的数据作用域隔离，严格限制学院管理员仅可审批与查看本院相关数据，并将敏感学籍信息变更与普通联系方式修改做分级审批和变更历史审计。</w:t>
+                              <w:t>在业务规则与状态流转方面，为转专业业务设计并实现了严密的有限状态机，覆盖资格初审、转出学院审核、转入学院考核赋分、拟录取公示与自动执行学籍变更的全链路闭环；针对高并发场景，设计了事务性防碰撞学号生成器；在权限控制上落实了细粒度的数据作用域隔离，严格限制学院管理员仅可审批与查看本院相关数据，并将敏感学籍信息变更与普通联系方式</w:t>
+                            </w:r>
+                            <w:proofErr w:type="gramStart"/>
+                            <w:r>
+                              <w:rPr>
+                                <w:rFonts w:ascii="宋体" w:eastAsia="宋体" w:hAnsi="宋体"/>
+                                <w:bCs/>
+                                <w:color w:val="000000"/>
+                                <w:szCs w:val="22"/>
+                                <w:lang w:eastAsia="zh-CN"/>
+                              </w:rPr>
+                              <w:t>修改做分级</w:t>
+                            </w:r>
+                            <w:proofErr w:type="gramEnd"/>
+                            <w:r>
+                              <w:rPr>
+                                <w:rFonts w:ascii="宋体" w:eastAsia="宋体" w:hAnsi="宋体"/>
+                                <w:bCs/>
+                                <w:color w:val="000000"/>
+                                <w:szCs w:val="22"/>
+                                <w:lang w:eastAsia="zh-CN"/>
+                              </w:rPr>
+                              <w:t>审批和变更历史审计。</w:t>
                             </w:r>
                           </w:p>
                           <w:p>
@@ -4069,7 +4668,29 @@
                                 <w:szCs w:val="22"/>
                                 <w:lang w:eastAsia="zh-CN"/>
                               </w:rPr>
-                              <w:t>在系统整合与体验优化中，我推进了客户端 UI 规范化改造，将多处生硬弹窗重构为内嵌式 Card Panel，保持交互连贯；优化登录服务，支持学生直接使用 8 位学号登录；完成</w:t>
+                              <w:t>在系统整合与体验优化中，我推进了客户端 UI 规范化改造，将多处</w:t>
+                            </w:r>
+                            <w:proofErr w:type="gramStart"/>
+                            <w:r>
+                              <w:rPr>
+                                <w:rFonts w:ascii="宋体" w:eastAsia="宋体" w:hAnsi="宋体"/>
+                                <w:bCs/>
+                                <w:color w:val="000000"/>
+                                <w:szCs w:val="22"/>
+                                <w:lang w:eastAsia="zh-CN"/>
+                              </w:rPr>
+                              <w:t>生硬弹窗重构</w:t>
+                            </w:r>
+                            <w:proofErr w:type="gramEnd"/>
+                            <w:r>
+                              <w:rPr>
+                                <w:rFonts w:ascii="宋体" w:eastAsia="宋体" w:hAnsi="宋体"/>
+                                <w:bCs/>
+                                <w:color w:val="000000"/>
+                                <w:szCs w:val="22"/>
+                                <w:lang w:eastAsia="zh-CN"/>
+                              </w:rPr>
+                              <w:t>为内嵌式 Card Panel，保持交互连贯；优化登录服务，支持学生直接使用 8 位学号登录；完成</w:t>
                             </w:r>
                             <w:proofErr w:type="spellStart"/>
                             <w:r>
@@ -4098,7 +4719,7 @@
                             <w:pPr>
                               <w:ind w:firstLine="420"/>
                               <w:rPr>
-                                <w:rFonts w:eastAsia="宋体" w:hint="eastAsia"/>
+                                <w:rFonts w:eastAsia="宋体"/>
                                 <w:bCs/>
                                 <w:color w:val="000000"/>
                                 <w:sz w:val="24"/>
@@ -4160,29 +4781,95 @@
                                 <w:szCs w:val="22"/>
                                 <w:lang w:eastAsia="zh-CN"/>
                               </w:rPr>
-                              <w:t>次项目让我深入实践了复杂企业级业务从底层数据建模、服务端状态机控制、接口通信到桌面端交互的完整研发闭环。学籍管理不仅是简单的增删改查，更紧密关联着学期时序、跨学院流转、敏感数据审计以及高并发下的数据一致性。转专业状态机与分级权限的开发让我认识到，核心业务约束必须在服务端通过事务和锁进行刚性校验，才能真正保障系统的数据安全与状态闭环。</w:t>
+                              <w:t>次项目让我深入实践了复杂企业级业务从底层数据建模、服务端状态机控制、接口通信到桌面端交互的完整研发闭环。学籍管理不仅是简单的增删改查，更紧密关联着学期时序、跨学院流转、敏感数据审计以及高并发下的数据一致性。转专业状态机与分级权限的</w:t>
+                            </w:r>
+                            <w:proofErr w:type="gramStart"/>
+                            <w:r>
+                              <w:rPr>
+                                <w:rFonts w:ascii="宋体" w:eastAsia="宋体" w:hAnsi="宋体"/>
+                                <w:bCs/>
+                                <w:color w:val="000000"/>
+                                <w:szCs w:val="22"/>
+                                <w:lang w:eastAsia="zh-CN"/>
+                              </w:rPr>
+                              <w:t>开发让</w:t>
+                            </w:r>
+                            <w:proofErr w:type="gramEnd"/>
+                            <w:r>
+                              <w:rPr>
+                                <w:rFonts w:ascii="宋体" w:eastAsia="宋体" w:hAnsi="宋体"/>
+                                <w:bCs/>
+                                <w:color w:val="000000"/>
+                                <w:szCs w:val="22"/>
+                                <w:lang w:eastAsia="zh-CN"/>
+                              </w:rPr>
+                              <w:t>我认识到，核心业务约束必须在服务端通过事务和</w:t>
+                            </w:r>
+                            <w:proofErr w:type="gramStart"/>
+                            <w:r>
+                              <w:rPr>
+                                <w:rFonts w:ascii="宋体" w:eastAsia="宋体" w:hAnsi="宋体"/>
+                                <w:bCs/>
+                                <w:color w:val="000000"/>
+                                <w:szCs w:val="22"/>
+                                <w:lang w:eastAsia="zh-CN"/>
+                              </w:rPr>
+                              <w:t>锁进行</w:t>
+                            </w:r>
+                            <w:proofErr w:type="gramEnd"/>
+                            <w:r>
+                              <w:rPr>
+                                <w:rFonts w:ascii="宋体" w:eastAsia="宋体" w:hAnsi="宋体"/>
+                                <w:bCs/>
+                                <w:color w:val="000000"/>
+                                <w:szCs w:val="22"/>
+                                <w:lang w:eastAsia="zh-CN"/>
+                              </w:rPr>
+                              <w:t>刚性校验，才能真正保障系统的数据安全与状态闭环。</w:t>
                             </w:r>
                           </w:p>
                           <w:p>
                             <w:pPr>
                               <w:ind w:firstLine="420"/>
                               <w:rPr>
-                                <w:rFonts w:ascii="宋体" w:eastAsia="宋体" w:hAnsi="宋体" w:hint="eastAsia"/>
-                                <w:bCs/>
-                                <w:color w:val="000000"/>
-                                <w:szCs w:val="22"/>
-                                <w:lang w:eastAsia="zh-CN"/>
-                              </w:rPr>
-                            </w:pPr>
-                            <w:r>
-                              <w:rPr>
-                                <w:rFonts w:ascii="宋体" w:eastAsia="宋体" w:hAnsi="宋体"/>
-                                <w:bCs/>
-                                <w:color w:val="000000"/>
-                                <w:szCs w:val="22"/>
-                                <w:lang w:eastAsia="zh-CN"/>
-                              </w:rPr>
-                              <w:t>在后续的系统整合与体验重构中，我深切体会到统一协议契约、模块边界划分以及全局权限治理对大型团队协作的决定性影响。通过将零散弹窗改造为嵌入式卡片、简化登录流程、完善自动化测试与环境配置，不仅显著提升了软件的交互品质，也保障了多模块合流的稳定性。这一过程极大地锻炼了我的系统架构思维、工程编码素养与团队协同能力</w:t>
+                                <w:rFonts w:ascii="宋体" w:eastAsia="宋体" w:hAnsi="宋体"/>
+                                <w:bCs/>
+                                <w:color w:val="000000"/>
+                                <w:szCs w:val="22"/>
+                                <w:lang w:eastAsia="zh-CN"/>
+                              </w:rPr>
+                            </w:pPr>
+                            <w:r>
+                              <w:rPr>
+                                <w:rFonts w:ascii="宋体" w:eastAsia="宋体" w:hAnsi="宋体"/>
+                                <w:bCs/>
+                                <w:color w:val="000000"/>
+                                <w:szCs w:val="22"/>
+                                <w:lang w:eastAsia="zh-CN"/>
+                              </w:rPr>
+                              <w:t>在后续的系统整合与体验重构中，我深切体会到统一协议契约、模块边界划分以及全局权限治理对大型团队协作的决定性影响。通过将零散</w:t>
+                            </w:r>
+                            <w:proofErr w:type="gramStart"/>
+                            <w:r>
+                              <w:rPr>
+                                <w:rFonts w:ascii="宋体" w:eastAsia="宋体" w:hAnsi="宋体"/>
+                                <w:bCs/>
+                                <w:color w:val="000000"/>
+                                <w:szCs w:val="22"/>
+                                <w:lang w:eastAsia="zh-CN"/>
+                              </w:rPr>
+                              <w:t>弹窗改造</w:t>
+                            </w:r>
+                            <w:proofErr w:type="gramEnd"/>
+                            <w:r>
+                              <w:rPr>
+                                <w:rFonts w:ascii="宋体" w:eastAsia="宋体" w:hAnsi="宋体"/>
+                                <w:bCs/>
+                                <w:color w:val="000000"/>
+                                <w:szCs w:val="22"/>
+                                <w:lang w:eastAsia="zh-CN"/>
+                              </w:rPr>
+                              <w:t>为嵌入式卡片、简化登录流程、完善自动化测试与环境配置，不仅显著提升了软件的交互品质，也保障了多模块合流的稳定性。这一过程极大地锻炼了我的系统架构思维、工程编码素养与团队协同能力</w:t>
                             </w:r>
                             <w:r>
                               <w:rPr>
@@ -4315,7 +5002,11 @@
           </mc:Choice>
           <mc:Fallback>
             <w:pict>
-              <v:shape w14:anchorId="7E6BF882" id="文本框 3" o:spid="_x0000_s1028" type="#_x0000_t202" style="position:absolute;margin-left:-53.5pt;margin-top:-30pt;width:521.7pt;height:774.5pt;z-index:251663360;visibility:visible;mso-wrap-style:square;mso-height-percent:0;mso-wrap-distance-left:9pt;mso-wrap-distance-top:0;mso-wrap-distance-right:9pt;mso-wrap-distance-bottom:0;mso-position-horizontal:absolute;mso-position-horizontal-relative:margin;mso-position-vertical:absolute;mso-position-vertical-relative:text;mso-height-percent:0;mso-height-relative:margin;v-text-anchor:top" o:gfxdata="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">
+              <v:shapetype w14:anchorId="7E6BF882" id="_x0000_t202" coordsize="21600,21600" o:spt="202" path="m,l,21600r21600,l21600,xe">
+                <v:stroke joinstyle="miter"/>
+                <v:path gradientshapeok="t" o:connecttype="rect"/>
+              </v:shapetype>
+              <v:shape id="文本框 3" o:spid="_x0000_s1028" type="#_x0000_t202" style="position:absolute;margin-left:-53.5pt;margin-top:-30pt;width:521.7pt;height:774.5pt;z-index:251663360;visibility:visible;mso-wrap-style:square;mso-height-percent:0;mso-wrap-distance-left:9pt;mso-wrap-distance-top:0;mso-wrap-distance-right:9pt;mso-wrap-distance-bottom:0;mso-position-horizontal:absolute;mso-position-horizontal-relative:margin;mso-position-vertical:absolute;mso-position-vertical-relative:text;mso-height-percent:0;mso-height-relative:margin;v-text-anchor:top" o:gfxdata="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">
                 <v:stroke miterlimit="2"/>
                 <v:textbox>
                   <w:txbxContent>
@@ -4567,6 +5258,7 @@
                           <w:rFonts w:ascii="宋体" w:eastAsia="宋体" w:hAnsi="宋体" w:hint="eastAsia"/>
                           <w:color w:val="000000"/>
                           <w:szCs w:val="22"/>
+                          <w:lang w:eastAsia="zh-CN"/>
                         </w:rPr>
                         <w:t>学籍管理模块</w:t>
                       </w:r>
@@ -4578,7 +5270,29 @@
                           <w:szCs w:val="22"/>
                           <w:lang w:eastAsia="zh-CN"/>
                         </w:rPr>
-                        <w:t xml:space="preserve">的设计、开发与后续完善，完成院系班级组织架构管理、学籍建立与档案维护、培养方案配置、成绩录入与成绩单查询、以及转专业审批全生命周期流转等核心功能。同时，我承担了全系统的权限体系规范与客户端体验优化工作，梳理并实现了超级管理员、学籍管理员、学院管理员、教师与学生的多级权限隔离与路由导航，推进无模态嵌入式卡片 UI 统一重构，并实现了基于学号直登的账号映射化简。在系统集成与底层支持方面，我参与了全局通信协议制定，负责 </w:t>
+                        <w:t>的设计、开发与后续完善，完成院系班级组织架构管理、学籍建立与档案维护、培养方案配置、成绩录入与成绩单查询、以及转专业</w:t>
+                      </w:r>
+                      <w:proofErr w:type="gramStart"/>
+                      <w:r>
+                        <w:rPr>
+                          <w:rFonts w:ascii="宋体" w:eastAsia="宋体" w:hAnsi="宋体" w:hint="eastAsia"/>
+                          <w:bCs/>
+                          <w:color w:val="000000"/>
+                          <w:szCs w:val="22"/>
+                          <w:lang w:eastAsia="zh-CN"/>
+                        </w:rPr>
+                        <w:t>审批全</w:t>
+                      </w:r>
+                      <w:proofErr w:type="gramEnd"/>
+                      <w:r>
+                        <w:rPr>
+                          <w:rFonts w:ascii="宋体" w:eastAsia="宋体" w:hAnsi="宋体" w:hint="eastAsia"/>
+                          <w:bCs/>
+                          <w:color w:val="000000"/>
+                          <w:szCs w:val="22"/>
+                          <w:lang w:eastAsia="zh-CN"/>
+                        </w:rPr>
+                        <w:t xml:space="preserve">生命周期流转等核心功能。同时，我承担了全系统的权限体系规范与客户端体验优化工作，梳理并实现了超级管理员、学籍管理员、学院管理员、教师与学生的多级权限隔离与路由导航，推进无模态嵌入式卡片 UI 统一重构，并实现了基于学号直登的账号映射化简。在系统集成与底层支持方面，我参与了全局通信协议制定，负责 </w:t>
                       </w:r>
                       <w:proofErr w:type="spellStart"/>
                       <w:r>
@@ -4606,7 +5320,7 @@
                     <w:p>
                       <w:pPr>
                         <w:rPr>
-                          <w:rFonts w:eastAsia="宋体" w:hint="eastAsia"/>
+                          <w:rFonts w:eastAsia="宋体"/>
                           <w:bCs/>
                           <w:color w:val="000000"/>
                           <w:sz w:val="24"/>
@@ -4668,7 +5382,73 @@
                           <w:szCs w:val="22"/>
                           <w:lang w:eastAsia="zh-CN"/>
                         </w:rPr>
-                        <w:t>我完成了学籍管理模块与相关子系统的核心功能研发。学生端实现了个人学籍档案在线查询、基本信息修改申请（支持草稿与撤回）、标准学籍证明 PDF 导出、个人培养方案修读进度比对、个人成绩单查询以及转专业志愿填报；管理端实现了学院/专业/班级层级维护、班级批量自动划分、学生档案手动建档与批量导入、培养方案课程导入、学生成绩录入与批量导入，以及转专业批次全流程管理。</w:t>
+                        <w:t>我完成了学籍管理模块与相关子系统的核心功能研发。学生</w:t>
+                      </w:r>
+                      <w:proofErr w:type="gramStart"/>
+                      <w:r>
+                        <w:rPr>
+                          <w:rFonts w:ascii="宋体" w:eastAsia="宋体" w:hAnsi="宋体"/>
+                          <w:bCs/>
+                          <w:color w:val="000000"/>
+                          <w:szCs w:val="22"/>
+                          <w:lang w:eastAsia="zh-CN"/>
+                        </w:rPr>
+                        <w:t>端实现</w:t>
+                      </w:r>
+                      <w:proofErr w:type="gramEnd"/>
+                      <w:r>
+                        <w:rPr>
+                          <w:rFonts w:ascii="宋体" w:eastAsia="宋体" w:hAnsi="宋体"/>
+                          <w:bCs/>
+                          <w:color w:val="000000"/>
+                          <w:szCs w:val="22"/>
+                          <w:lang w:eastAsia="zh-CN"/>
+                        </w:rPr>
+                        <w:t>了个人学籍档案在线查询、基本信息修改申请（支持草稿与撤回）、标准学籍证明 PDF 导出、个人培养方案修读进度比对、个人成绩单查询以及转专业志愿填报；管理</w:t>
+                      </w:r>
+                      <w:proofErr w:type="gramStart"/>
+                      <w:r>
+                        <w:rPr>
+                          <w:rFonts w:ascii="宋体" w:eastAsia="宋体" w:hAnsi="宋体"/>
+                          <w:bCs/>
+                          <w:color w:val="000000"/>
+                          <w:szCs w:val="22"/>
+                          <w:lang w:eastAsia="zh-CN"/>
+                        </w:rPr>
+                        <w:t>端实现</w:t>
+                      </w:r>
+                      <w:proofErr w:type="gramEnd"/>
+                      <w:r>
+                        <w:rPr>
+                          <w:rFonts w:ascii="宋体" w:eastAsia="宋体" w:hAnsi="宋体"/>
+                          <w:bCs/>
+                          <w:color w:val="000000"/>
+                          <w:szCs w:val="22"/>
+                          <w:lang w:eastAsia="zh-CN"/>
+                        </w:rPr>
+                        <w:t>了学院/专业/班级层级维护、班级批量自动划分、学生档案手动建档与批量导入、培养方案课程导入、学生成绩录入与批量导入，以及转专业</w:t>
+                      </w:r>
+                      <w:proofErr w:type="gramStart"/>
+                      <w:r>
+                        <w:rPr>
+                          <w:rFonts w:ascii="宋体" w:eastAsia="宋体" w:hAnsi="宋体"/>
+                          <w:bCs/>
+                          <w:color w:val="000000"/>
+                          <w:szCs w:val="22"/>
+                          <w:lang w:eastAsia="zh-CN"/>
+                        </w:rPr>
+                        <w:t>批次全</w:t>
+                      </w:r>
+                      <w:proofErr w:type="gramEnd"/>
+                      <w:r>
+                        <w:rPr>
+                          <w:rFonts w:ascii="宋体" w:eastAsia="宋体" w:hAnsi="宋体"/>
+                          <w:bCs/>
+                          <w:color w:val="000000"/>
+                          <w:szCs w:val="22"/>
+                          <w:lang w:eastAsia="zh-CN"/>
+                        </w:rPr>
+                        <w:t>流程管理。</w:t>
                       </w:r>
                     </w:p>
                     <w:p>
@@ -4690,7 +5470,29 @@
                           <w:szCs w:val="22"/>
                           <w:lang w:eastAsia="zh-CN"/>
                         </w:rPr>
-                        <w:t>在业务规则与状态流转方面，为转专业业务设计并实现了严密的有限状态机，覆盖资格初审、转出学院审核、转入学院考核赋分、拟录取公示与自动执行学籍变更的全链路闭环；针对高并发场景，设计了事务性防碰撞学号生成器；在权限控制上落实了细粒度的数据作用域隔离，严格限制学院管理员仅可审批与查看本院相关数据，并将敏感学籍信息变更与普通联系方式修改做分级审批和变更历史审计。</w:t>
+                        <w:t>在业务规则与状态流转方面，为转专业业务设计并实现了严密的有限状态机，覆盖资格初审、转出学院审核、转入学院考核赋分、拟录取公示与自动执行学籍变更的全链路闭环；针对高并发场景，设计了事务性防碰撞学号生成器；在权限控制上落实了细粒度的数据作用域隔离，严格限制学院管理员仅可审批与查看本院相关数据，并将敏感学籍信息变更与普通联系方式</w:t>
+                      </w:r>
+                      <w:proofErr w:type="gramStart"/>
+                      <w:r>
+                        <w:rPr>
+                          <w:rFonts w:ascii="宋体" w:eastAsia="宋体" w:hAnsi="宋体"/>
+                          <w:bCs/>
+                          <w:color w:val="000000"/>
+                          <w:szCs w:val="22"/>
+                          <w:lang w:eastAsia="zh-CN"/>
+                        </w:rPr>
+                        <w:t>修改做分级</w:t>
+                      </w:r>
+                      <w:proofErr w:type="gramEnd"/>
+                      <w:r>
+                        <w:rPr>
+                          <w:rFonts w:ascii="宋体" w:eastAsia="宋体" w:hAnsi="宋体"/>
+                          <w:bCs/>
+                          <w:color w:val="000000"/>
+                          <w:szCs w:val="22"/>
+                          <w:lang w:eastAsia="zh-CN"/>
+                        </w:rPr>
+                        <w:t>审批和变更历史审计。</w:t>
                       </w:r>
                     </w:p>
                     <w:p>
@@ -4712,7 +5514,29 @@
                           <w:szCs w:val="22"/>
                           <w:lang w:eastAsia="zh-CN"/>
                         </w:rPr>
-                        <w:t>在系统整合与体验优化中，我推进了客户端 UI 规范化改造，将多处生硬弹窗重构为内嵌式 Card Panel，保持交互连贯；优化登录服务，支持学生直接使用 8 位学号登录；完成</w:t>
+                        <w:t>在系统整合与体验优化中，我推进了客户端 UI 规范化改造，将多处</w:t>
+                      </w:r>
+                      <w:proofErr w:type="gramStart"/>
+                      <w:r>
+                        <w:rPr>
+                          <w:rFonts w:ascii="宋体" w:eastAsia="宋体" w:hAnsi="宋体"/>
+                          <w:bCs/>
+                          <w:color w:val="000000"/>
+                          <w:szCs w:val="22"/>
+                          <w:lang w:eastAsia="zh-CN"/>
+                        </w:rPr>
+                        <w:t>生硬弹窗重构</w:t>
+                      </w:r>
+                      <w:proofErr w:type="gramEnd"/>
+                      <w:r>
+                        <w:rPr>
+                          <w:rFonts w:ascii="宋体" w:eastAsia="宋体" w:hAnsi="宋体"/>
+                          <w:bCs/>
+                          <w:color w:val="000000"/>
+                          <w:szCs w:val="22"/>
+                          <w:lang w:eastAsia="zh-CN"/>
+                        </w:rPr>
+                        <w:t>为内嵌式 Card Panel，保持交互连贯；优化登录服务，支持学生直接使用 8 位学号登录；完成</w:t>
                       </w:r>
                       <w:proofErr w:type="spellStart"/>
                       <w:r>
@@ -4741,7 +5565,7 @@
                       <w:pPr>
                         <w:ind w:firstLine="420"/>
                         <w:rPr>
-                          <w:rFonts w:eastAsia="宋体" w:hint="eastAsia"/>
+                          <w:rFonts w:eastAsia="宋体"/>
                           <w:bCs/>
                           <w:color w:val="000000"/>
                           <w:sz w:val="24"/>
@@ -4803,14 +5627,58 @@
                           <w:szCs w:val="22"/>
                           <w:lang w:eastAsia="zh-CN"/>
                         </w:rPr>
-                        <w:t>次项目让我深入实践了复杂企业级业务从底层数据建模、服务端状态机控制、接口通信到桌面端交互的完整研发闭环。学籍管理不仅是简单的增删改查，更紧密关联着学期时序、跨学院流转、敏感数据审计以及高并发下的数据一致性。转专业状态机与分级权限的开发让我认识到，核心业务约束必须在服务端通过事务和锁进行刚性校验，才能真正保障系统的数据安全与状态闭环。</w:t>
+                        <w:t>次项目让我深入实践了复杂企业级业务从底层数据建模、服务端状态机控制、接口通信到桌面端交互的完整研发闭环。学籍管理不仅是简单的增删改查，更紧密关联着学期时序、跨学院流转、敏感数据审计以及高并发下的数据一致性。转专业状态机与分级权限的</w:t>
+                      </w:r>
+                      <w:proofErr w:type="gramStart"/>
+                      <w:r>
+                        <w:rPr>
+                          <w:rFonts w:ascii="宋体" w:eastAsia="宋体" w:hAnsi="宋体"/>
+                          <w:bCs/>
+                          <w:color w:val="000000"/>
+                          <w:szCs w:val="22"/>
+                          <w:lang w:eastAsia="zh-CN"/>
+                        </w:rPr>
+                        <w:t>开发让</w:t>
+                      </w:r>
+                      <w:proofErr w:type="gramEnd"/>
+                      <w:r>
+                        <w:rPr>
+                          <w:rFonts w:ascii="宋体" w:eastAsia="宋体" w:hAnsi="宋体"/>
+                          <w:bCs/>
+                          <w:color w:val="000000"/>
+                          <w:szCs w:val="22"/>
+                          <w:lang w:eastAsia="zh-CN"/>
+                        </w:rPr>
+                        <w:t>我认识到，核心业务约束必须在服务端通过事务和</w:t>
+                      </w:r>
+                      <w:proofErr w:type="gramStart"/>
+                      <w:r>
+                        <w:rPr>
+                          <w:rFonts w:ascii="宋体" w:eastAsia="宋体" w:hAnsi="宋体"/>
+                          <w:bCs/>
+                          <w:color w:val="000000"/>
+                          <w:szCs w:val="22"/>
+                          <w:lang w:eastAsia="zh-CN"/>
+                        </w:rPr>
+                        <w:t>锁进行</w:t>
+                      </w:r>
+                      <w:proofErr w:type="gramEnd"/>
+                      <w:r>
+                        <w:rPr>
+                          <w:rFonts w:ascii="宋体" w:eastAsia="宋体" w:hAnsi="宋体"/>
+                          <w:bCs/>
+                          <w:color w:val="000000"/>
+                          <w:szCs w:val="22"/>
+                          <w:lang w:eastAsia="zh-CN"/>
+                        </w:rPr>
+                        <w:t>刚性校验，才能真正保障系统的数据安全与状态闭环。</w:t>
                       </w:r>
                     </w:p>
                     <w:p>
                       <w:pPr>
                         <w:ind w:firstLine="420"/>
                         <w:rPr>
-                          <w:rFonts w:ascii="宋体" w:eastAsia="宋体" w:hAnsi="宋体" w:hint="eastAsia"/>
+                          <w:rFonts w:ascii="宋体" w:eastAsia="宋体" w:hAnsi="宋体"/>
                           <w:bCs/>
                           <w:color w:val="000000"/>
                           <w:szCs w:val="22"/>
@@ -4825,7 +5693,29 @@
                           <w:szCs w:val="22"/>
                           <w:lang w:eastAsia="zh-CN"/>
                         </w:rPr>
-                        <w:t>在后续的系统整合与体验重构中，我深切体会到统一协议契约、模块边界划分以及全局权限治理对大型团队协作的决定性影响。通过将零散弹窗改造为嵌入式卡片、简化登录流程、完善自动化测试与环境配置，不仅显著提升了软件的交互品质，也保障了多模块合流的稳定性。这一过程极大地锻炼了我的系统架构思维、工程编码素养与团队协同能力</w:t>
+                        <w:t>在后续的系统整合与体验重构中，我深切体会到统一协议契约、模块边界划分以及全局权限治理对大型团队协作的决定性影响。通过将零散</w:t>
+                      </w:r>
+                      <w:proofErr w:type="gramStart"/>
+                      <w:r>
+                        <w:rPr>
+                          <w:rFonts w:ascii="宋体" w:eastAsia="宋体" w:hAnsi="宋体"/>
+                          <w:bCs/>
+                          <w:color w:val="000000"/>
+                          <w:szCs w:val="22"/>
+                          <w:lang w:eastAsia="zh-CN"/>
+                        </w:rPr>
+                        <w:t>弹窗改造</w:t>
+                      </w:r>
+                      <w:proofErr w:type="gramEnd"/>
+                      <w:r>
+                        <w:rPr>
+                          <w:rFonts w:ascii="宋体" w:eastAsia="宋体" w:hAnsi="宋体"/>
+                          <w:bCs/>
+                          <w:color w:val="000000"/>
+                          <w:szCs w:val="22"/>
+                          <w:lang w:eastAsia="zh-CN"/>
+                        </w:rPr>
+                        <w:t>为嵌入式卡片、简化登录流程、完善自动化测试与环境配置，不仅显著提升了软件的交互品质，也保障了多模块合流的稳定性。这一过程极大地锻炼了我的系统架构思维、工程编码素养与团队协同能力</w:t>
                       </w:r>
                       <w:r>
                         <w:rPr>
@@ -5410,13 +6300,45 @@
                                 <w:rFonts w:ascii="宋体" w:eastAsia="宋体" w:hAnsi="宋体"/>
                                 <w:lang w:eastAsia="zh-CN"/>
                               </w:rPr>
-                              <w:t xml:space="preserve"> 校园商城模块的设计、开发与后续完善，完成商品浏览与搜索、购物车、跨店结算、订单管理、钱包及商家入驻审核等功能，承担买家、卖家和管理员相关界面的开发。同时，我参与项目多模块整合，完成统一客户端入口、服务端模块注册、演示数据库和运行包的整理，并根据联调反馈持续修复界面交互与启动问题，为组内测试和项目演示提供支持。</w:t>
-                            </w:r>
-                          </w:p>
-                          <w:p>
-                            <w:pPr>
-                              <w:rPr>
-                                <w:rFonts w:ascii="宋体" w:eastAsia="宋体" w:hAnsi="宋体" w:hint="eastAsia"/>
+                              <w:t xml:space="preserve"> 校园商城模块的设计、开发与后续完善，完成商品浏览与搜索、购物车、</w:t>
+                            </w:r>
+                            <w:proofErr w:type="gramStart"/>
+                            <w:r>
+                              <w:rPr>
+                                <w:rFonts w:ascii="宋体" w:eastAsia="宋体" w:hAnsi="宋体"/>
+                                <w:lang w:eastAsia="zh-CN"/>
+                              </w:rPr>
+                              <w:t>跨店结算</w:t>
+                            </w:r>
+                            <w:proofErr w:type="gramEnd"/>
+                            <w:r>
+                              <w:rPr>
+                                <w:rFonts w:ascii="宋体" w:eastAsia="宋体" w:hAnsi="宋体"/>
+                                <w:lang w:eastAsia="zh-CN"/>
+                              </w:rPr>
+                              <w:t>、订单管理、钱包及商家入驻审核等功能，承担买家、卖家和管理员相关界面的开发。同时，我参与项目多模块整合，完成统一客户端入口、服务端模块注册、演示数据库和运行包的整理，并根据联调反馈持续修复界面</w:t>
+                            </w:r>
+                            <w:proofErr w:type="gramStart"/>
+                            <w:r>
+                              <w:rPr>
+                                <w:rFonts w:ascii="宋体" w:eastAsia="宋体" w:hAnsi="宋体"/>
+                                <w:lang w:eastAsia="zh-CN"/>
+                              </w:rPr>
+                              <w:t>交互与</w:t>
+                            </w:r>
+                            <w:proofErr w:type="gramEnd"/>
+                            <w:r>
+                              <w:rPr>
+                                <w:rFonts w:ascii="宋体" w:eastAsia="宋体" w:hAnsi="宋体"/>
+                                <w:lang w:eastAsia="zh-CN"/>
+                              </w:rPr>
+                              <w:t>启动问题，为组内测试和项目演示提供支持。</w:t>
+                            </w:r>
+                          </w:p>
+                          <w:p>
+                            <w:pPr>
+                              <w:rPr>
+                                <w:rFonts w:ascii="宋体" w:eastAsia="宋体" w:hAnsi="宋体"/>
                                 <w:lang w:eastAsia="zh-CN"/>
                               </w:rPr>
                             </w:pPr>
@@ -5475,7 +6397,51 @@
                                 <w:szCs w:val="22"/>
                                 <w:lang w:eastAsia="zh-CN"/>
                               </w:rPr>
-                              <w:t>在商城业务开发方面，我逐步完成了商品分类、关键词搜索、店铺浏览、商品规格选择、购物车维护和订单查询等功能，并实现跨店结算、库存预留及支付相关处理。后续进一步接入钱包余额、充值和流水查询，补充订单状态流转与异常情况处理，使商品选购、结算和订单后续操作形成较完整的业务流程。</w:t>
+                              <w:t>在商城业务开发方面，我逐步完成了商品分类、关键词搜索、店铺浏览、商品规格选择、购物</w:t>
+                            </w:r>
+                            <w:proofErr w:type="gramStart"/>
+                            <w:r>
+                              <w:rPr>
+                                <w:rFonts w:ascii="宋体" w:eastAsia="宋体" w:hAnsi="宋体"/>
+                                <w:bCs/>
+                                <w:color w:val="000000"/>
+                                <w:szCs w:val="22"/>
+                                <w:lang w:eastAsia="zh-CN"/>
+                              </w:rPr>
+                              <w:t>车维护</w:t>
+                            </w:r>
+                            <w:proofErr w:type="gramEnd"/>
+                            <w:r>
+                              <w:rPr>
+                                <w:rFonts w:ascii="宋体" w:eastAsia="宋体" w:hAnsi="宋体"/>
+                                <w:bCs/>
+                                <w:color w:val="000000"/>
+                                <w:szCs w:val="22"/>
+                                <w:lang w:eastAsia="zh-CN"/>
+                              </w:rPr>
+                              <w:t>和订单查询等功能，并</w:t>
+                            </w:r>
+                            <w:proofErr w:type="gramStart"/>
+                            <w:r>
+                              <w:rPr>
+                                <w:rFonts w:ascii="宋体" w:eastAsia="宋体" w:hAnsi="宋体"/>
+                                <w:bCs/>
+                                <w:color w:val="000000"/>
+                                <w:szCs w:val="22"/>
+                                <w:lang w:eastAsia="zh-CN"/>
+                              </w:rPr>
+                              <w:t>实现跨店结算</w:t>
+                            </w:r>
+                            <w:proofErr w:type="gramEnd"/>
+                            <w:r>
+                              <w:rPr>
+                                <w:rFonts w:ascii="宋体" w:eastAsia="宋体" w:hAnsi="宋体"/>
+                                <w:bCs/>
+                                <w:color w:val="000000"/>
+                                <w:szCs w:val="22"/>
+                                <w:lang w:eastAsia="zh-CN"/>
+                              </w:rPr>
+                              <w:t>、库存预留及支付相关处理。后续进一步接入钱包余额、充值和流水查询，补充订单状态流转与异常情况处理，使商品选购、结算和订单后续操作形成较完整的业务流程。</w:t>
                             </w:r>
                           </w:p>
                           <w:p>
@@ -5497,7 +6463,29 @@
                                 <w:szCs w:val="22"/>
                                 <w:lang w:eastAsia="zh-CN"/>
                               </w:rPr>
-                              <w:t>在卖家和管理员功能方面，我完成了商家申请、申请审核、店铺状态管理，以及商品与规格维护、订单查看等功能，并补充商品批量导入及相应校验。围绕不同角色的操作范围，在服务端落实身份与权限检查，对商品管理、店铺管理和审核操作设置业务约束，保障各类用户按照权限使用商城功能。</w:t>
+                              <w:t>在卖家和管理员功能方面，我完成了商家申请、申请审核、店铺状态管理，以及商品与规格维护、订单查看等功能，并补充商品批量导入及相应校验。围绕不同角色的操作范围，在服务</w:t>
+                            </w:r>
+                            <w:proofErr w:type="gramStart"/>
+                            <w:r>
+                              <w:rPr>
+                                <w:rFonts w:ascii="宋体" w:eastAsia="宋体" w:hAnsi="宋体"/>
+                                <w:bCs/>
+                                <w:color w:val="000000"/>
+                                <w:szCs w:val="22"/>
+                                <w:lang w:eastAsia="zh-CN"/>
+                              </w:rPr>
+                              <w:t>端落实</w:t>
+                            </w:r>
+                            <w:proofErr w:type="gramEnd"/>
+                            <w:r>
+                              <w:rPr>
+                                <w:rFonts w:ascii="宋体" w:eastAsia="宋体" w:hAnsi="宋体"/>
+                                <w:bCs/>
+                                <w:color w:val="000000"/>
+                                <w:szCs w:val="22"/>
+                                <w:lang w:eastAsia="zh-CN"/>
+                              </w:rPr>
+                              <w:t>身份与权限检查，对商品管理、店铺管理和审核操作设置业务约束，保障各类用户按照权限使用商城功能。</w:t>
                             </w:r>
                           </w:p>
                           <w:p>
@@ -5519,7 +6507,29 @@
                                 <w:szCs w:val="22"/>
                                 <w:lang w:eastAsia="zh-CN"/>
                               </w:rPr>
-                              <w:t>在客户端交互方面，我完成了商城页面与统一校园主界面的接入，持续调整商品卡片、搜索筛选、购物车金额展示、商品编辑和订单页面。针对使用过程中发现的返回层级混乱、页面状态丢失、刷新不及时等问题，完善导航状态管理与异步请求处理，并补充相关测试，使页面切换和操作反馈更加连贯。</w:t>
+                              <w:t>在客户端交互方面，我完成了商城页面与统一校园主界面的接入，持续调整商品卡片、搜索筛选、购物</w:t>
+                            </w:r>
+                            <w:proofErr w:type="gramStart"/>
+                            <w:r>
+                              <w:rPr>
+                                <w:rFonts w:ascii="宋体" w:eastAsia="宋体" w:hAnsi="宋体"/>
+                                <w:bCs/>
+                                <w:color w:val="000000"/>
+                                <w:szCs w:val="22"/>
+                                <w:lang w:eastAsia="zh-CN"/>
+                              </w:rPr>
+                              <w:t>车金额</w:t>
+                            </w:r>
+                            <w:proofErr w:type="gramEnd"/>
+                            <w:r>
+                              <w:rPr>
+                                <w:rFonts w:ascii="宋体" w:eastAsia="宋体" w:hAnsi="宋体"/>
+                                <w:bCs/>
+                                <w:color w:val="000000"/>
+                                <w:szCs w:val="22"/>
+                                <w:lang w:eastAsia="zh-CN"/>
+                              </w:rPr>
+                              <w:t>展示、商品编辑和订单页面。针对使用过程中发现的返回层级混乱、页面状态丢失、刷新不及时等问题，完善导航状态管理与异步请求处理，并补充相关测试，使页面切换和操作反馈更加连贯。</w:t>
                             </w:r>
                           </w:p>
                           <w:p>
@@ -5541,7 +6551,73 @@
                                 <w:szCs w:val="22"/>
                                 <w:lang w:eastAsia="zh-CN"/>
                               </w:rPr>
-                              <w:t>在系统整合与交付方面，我参与合并用户管理、学籍、选课和图书馆等模块，处理统一登录后的功能入口、服务端消息路由和数据库初始化等衔接问题。同时，我整理并补齐全模块测试数据，更新 Access 数据库、启动脚本、运行包和测试说明，支持组员在统一环境下开展功能检查与演示。针对服务端启动、商家审批后页面刷新等联调问题，也进行了修复和完善。</w:t>
+                              <w:t>在系统整合与交付方面，我参与合并用户管理、学籍、选课和图书馆等模块，处理统一登录后的功能入口、服务</w:t>
+                            </w:r>
+                            <w:proofErr w:type="gramStart"/>
+                            <w:r>
+                              <w:rPr>
+                                <w:rFonts w:ascii="宋体" w:eastAsia="宋体" w:hAnsi="宋体"/>
+                                <w:bCs/>
+                                <w:color w:val="000000"/>
+                                <w:szCs w:val="22"/>
+                                <w:lang w:eastAsia="zh-CN"/>
+                              </w:rPr>
+                              <w:t>端消息</w:t>
+                            </w:r>
+                            <w:proofErr w:type="gramEnd"/>
+                            <w:r>
+                              <w:rPr>
+                                <w:rFonts w:ascii="宋体" w:eastAsia="宋体" w:hAnsi="宋体"/>
+                                <w:bCs/>
+                                <w:color w:val="000000"/>
+                                <w:szCs w:val="22"/>
+                                <w:lang w:eastAsia="zh-CN"/>
+                              </w:rPr>
+                              <w:t>路由和数据库初始化等衔接问题。同时，我整理并</w:t>
+                            </w:r>
+                            <w:proofErr w:type="gramStart"/>
+                            <w:r>
+                              <w:rPr>
+                                <w:rFonts w:ascii="宋体" w:eastAsia="宋体" w:hAnsi="宋体"/>
+                                <w:bCs/>
+                                <w:color w:val="000000"/>
+                                <w:szCs w:val="22"/>
+                                <w:lang w:eastAsia="zh-CN"/>
+                              </w:rPr>
+                              <w:t>补齐全</w:t>
+                            </w:r>
+                            <w:proofErr w:type="gramEnd"/>
+                            <w:r>
+                              <w:rPr>
+                                <w:rFonts w:ascii="宋体" w:eastAsia="宋体" w:hAnsi="宋体"/>
+                                <w:bCs/>
+                                <w:color w:val="000000"/>
+                                <w:szCs w:val="22"/>
+                                <w:lang w:eastAsia="zh-CN"/>
+                              </w:rPr>
+                              <w:t>模块测试数据，更新 Access 数据库、启动脚本、运行包和测试说明，支持组员在统一环境下开展功能检查与演示。针对服务端启动、</w:t>
+                            </w:r>
+                            <w:proofErr w:type="gramStart"/>
+                            <w:r>
+                              <w:rPr>
+                                <w:rFonts w:ascii="宋体" w:eastAsia="宋体" w:hAnsi="宋体"/>
+                                <w:bCs/>
+                                <w:color w:val="000000"/>
+                                <w:szCs w:val="22"/>
+                                <w:lang w:eastAsia="zh-CN"/>
+                              </w:rPr>
+                              <w:t>商家审批</w:t>
+                            </w:r>
+                            <w:proofErr w:type="gramEnd"/>
+                            <w:r>
+                              <w:rPr>
+                                <w:rFonts w:ascii="宋体" w:eastAsia="宋体" w:hAnsi="宋体"/>
+                                <w:bCs/>
+                                <w:color w:val="000000"/>
+                                <w:szCs w:val="22"/>
+                                <w:lang w:eastAsia="zh-CN"/>
+                              </w:rPr>
+                              <w:t>后页面刷新等联调问题，也进行了修复和完善。</w:t>
                             </w:r>
                           </w:p>
                           <w:p>
@@ -5620,7 +6696,29 @@
                                 <w:szCs w:val="22"/>
                                 <w:lang w:eastAsia="zh-CN"/>
                               </w:rPr>
-                              <w:t>本次项目让我较完整地经历了业务需求梳理、数据结构设计、服务端实现、客户端交互和系统集成的过程。商城中的库存、订单与资金相互关联，一次结算涉及多处数据变化，需要明确操作顺序、事务边界和重复请求的处理方式。通过这些功能的实现，我加深了对数据一致性、权限校验和异常处理的理解，也更加重视业务规则在服务端的落实。</w:t>
+                              <w:t>本次项目让我较完整地经历了业务需求梳理、数据结构设计、服务端实现、客户端</w:t>
+                            </w:r>
+                            <w:proofErr w:type="gramStart"/>
+                            <w:r>
+                              <w:rPr>
+                                <w:rFonts w:eastAsia="宋体"/>
+                                <w:bCs/>
+                                <w:color w:val="000000"/>
+                                <w:szCs w:val="22"/>
+                                <w:lang w:eastAsia="zh-CN"/>
+                              </w:rPr>
+                              <w:t>交互和</w:t>
+                            </w:r>
+                            <w:proofErr w:type="gramEnd"/>
+                            <w:r>
+                              <w:rPr>
+                                <w:rFonts w:eastAsia="宋体"/>
+                                <w:bCs/>
+                                <w:color w:val="000000"/>
+                                <w:szCs w:val="22"/>
+                                <w:lang w:eastAsia="zh-CN"/>
+                              </w:rPr>
+                              <w:t>系统集成的过程。商城中的库存、订单与资金相互关联，一次结算涉及多处数据变化，需要明确操作顺序、事务边界和重复请求的处理方式。通过这些功能的实现，我加深了对数据一致性、权限校验和异常处理的理解，也更加重视业务规则在服务端的落实。</w:t>
                             </w:r>
                           </w:p>
                           <w:p>
@@ -6757,7 +7855,61 @@
                                 <w:sz w:val="22"/>
                                 <w:lang w:eastAsia="zh-CN"/>
                               </w:rPr>
-                              <w:t>功能完善阶段，我重点处理了认证、权限与会话管理：完善密码修改和首次登录密码修改流程，实现密码重置，增加密码显示切换和退出确认；补充登录失败审计、请求幂等处理和异常映射，并处理重复登录、登录锁定周期重置等情况。针对权限变更和密码重置后的安全性，我完善了会话撤销及客户端会话提示，避免权限变化后旧会话继续使用。</w:t>
+                              <w:t>功能完善阶段，我重点处理了认证、权限与会话管理：完善密码修改和首次登录密码修改流程，实现密码重置，增加密码显示切换和退出确认；补充登录失败审计、请求</w:t>
+                            </w:r>
+                            <w:proofErr w:type="gramStart"/>
+                            <w:r>
+                              <w:rPr>
+                                <w:rFonts w:ascii="宋体" w:eastAsia="宋体" w:hAnsi="宋体"/>
+                                <w:sz w:val="22"/>
+                                <w:lang w:eastAsia="zh-CN"/>
+                              </w:rPr>
+                              <w:t>幂</w:t>
+                            </w:r>
+                            <w:proofErr w:type="gramEnd"/>
+                            <w:r>
+                              <w:rPr>
+                                <w:rFonts w:ascii="宋体" w:eastAsia="宋体" w:hAnsi="宋体"/>
+                                <w:sz w:val="22"/>
+                                <w:lang w:eastAsia="zh-CN"/>
+                              </w:rPr>
+                              <w:t>等处理和异常映射，并处理重复登录、登录锁定周期重置等情况。针对权限变更和密码重置后的安全性，</w:t>
+                            </w:r>
+                            <w:proofErr w:type="gramStart"/>
+                            <w:r>
+                              <w:rPr>
+                                <w:rFonts w:ascii="宋体" w:eastAsia="宋体" w:hAnsi="宋体"/>
+                                <w:sz w:val="22"/>
+                                <w:lang w:eastAsia="zh-CN"/>
+                              </w:rPr>
+                              <w:t>我完善</w:t>
+                            </w:r>
+                            <w:proofErr w:type="gramEnd"/>
+                            <w:r>
+                              <w:rPr>
+                                <w:rFonts w:ascii="宋体" w:eastAsia="宋体" w:hAnsi="宋体"/>
+                                <w:sz w:val="22"/>
+                                <w:lang w:eastAsia="zh-CN"/>
+                              </w:rPr>
+                              <w:t>了会话撤销及客户端会话提示，避免权限</w:t>
+                            </w:r>
+                            <w:proofErr w:type="gramStart"/>
+                            <w:r>
+                              <w:rPr>
+                                <w:rFonts w:ascii="宋体" w:eastAsia="宋体" w:hAnsi="宋体"/>
+                                <w:sz w:val="22"/>
+                                <w:lang w:eastAsia="zh-CN"/>
+                              </w:rPr>
+                              <w:t>变化后旧会话</w:t>
+                            </w:r>
+                            <w:proofErr w:type="gramEnd"/>
+                            <w:r>
+                              <w:rPr>
+                                <w:rFonts w:ascii="宋体" w:eastAsia="宋体" w:hAnsi="宋体"/>
+                                <w:sz w:val="22"/>
+                                <w:lang w:eastAsia="zh-CN"/>
+                              </w:rPr>
+                              <w:t>继续使用。</w:t>
                             </w:r>
                           </w:p>
                           <w:p>
@@ -6777,7 +7929,61 @@
                                 <w:sz w:val="22"/>
                                 <w:lang w:eastAsia="zh-CN"/>
                               </w:rPr>
-                              <w:t>我也参与了角色与模块权限管理的调整，补充模块管理员相关界面、服务端处理逻辑及测试，并整理了分级管理方案。除用户管理主线外，我协助整合学生、课程等模块的更新，调整并同步测试数据和客户端、服务端运行包。项目收尾期间，我参与打包 JAR、整理操作与验收说明、补充公共模块、服务端和客户端的</w:t>
+                              <w:t>我也参与了角色与模块权限管理的调整，补充模块管理员相关界面、服务</w:t>
+                            </w:r>
+                            <w:proofErr w:type="gramStart"/>
+                            <w:r>
+                              <w:rPr>
+                                <w:rFonts w:ascii="宋体" w:eastAsia="宋体" w:hAnsi="宋体"/>
+                                <w:sz w:val="22"/>
+                                <w:lang w:eastAsia="zh-CN"/>
+                              </w:rPr>
+                              <w:t>端处理</w:t>
+                            </w:r>
+                            <w:proofErr w:type="gramEnd"/>
+                            <w:r>
+                              <w:rPr>
+                                <w:rFonts w:ascii="宋体" w:eastAsia="宋体" w:hAnsi="宋体"/>
+                                <w:sz w:val="22"/>
+                                <w:lang w:eastAsia="zh-CN"/>
+                              </w:rPr>
+                              <w:t>逻辑及测试，并整理了分级管理方案。</w:t>
+                            </w:r>
+                            <w:proofErr w:type="gramStart"/>
+                            <w:r>
+                              <w:rPr>
+                                <w:rFonts w:ascii="宋体" w:eastAsia="宋体" w:hAnsi="宋体"/>
+                                <w:sz w:val="22"/>
+                                <w:lang w:eastAsia="zh-CN"/>
+                              </w:rPr>
+                              <w:t>除用户</w:t>
+                            </w:r>
+                            <w:proofErr w:type="gramEnd"/>
+                            <w:r>
+                              <w:rPr>
+                                <w:rFonts w:ascii="宋体" w:eastAsia="宋体" w:hAnsi="宋体"/>
+                                <w:sz w:val="22"/>
+                                <w:lang w:eastAsia="zh-CN"/>
+                              </w:rPr>
+                              <w:t>管理主线外，我协助整合学生、课程等模块的更新，调整并同步测试数据和客户端、</w:t>
+                            </w:r>
+                            <w:proofErr w:type="gramStart"/>
+                            <w:r>
+                              <w:rPr>
+                                <w:rFonts w:ascii="宋体" w:eastAsia="宋体" w:hAnsi="宋体"/>
+                                <w:sz w:val="22"/>
+                                <w:lang w:eastAsia="zh-CN"/>
+                              </w:rPr>
+                              <w:t>服务端运行包</w:t>
+                            </w:r>
+                            <w:proofErr w:type="gramEnd"/>
+                            <w:r>
+                              <w:rPr>
+                                <w:rFonts w:ascii="宋体" w:eastAsia="宋体" w:hAnsi="宋体"/>
+                                <w:sz w:val="22"/>
+                                <w:lang w:eastAsia="zh-CN"/>
+                              </w:rPr>
+                              <w:t>。项目收尾期间，我参与打包 JAR、整理操作与验收说明、补充公共模块、服务端和客户端的</w:t>
                             </w:r>
                             <w:proofErr w:type="spellStart"/>
                             <w:r>
@@ -6804,7 +8010,7 @@
                               <w:spacing w:before="0" w:after="0" w:line="276" w:lineRule="auto"/>
                               <w:ind w:firstLine="420"/>
                               <w:rPr>
-                                <w:rFonts w:eastAsia="宋体" w:hint="eastAsia"/>
+                                <w:rFonts w:eastAsia="宋体"/>
                                 <w:sz w:val="22"/>
                                 <w:lang w:eastAsia="zh-CN"/>
                               </w:rPr>
@@ -6874,24 +8080,32 @@
                               </w:rPr>
                               <w:t>在协作方面，我通过合并和适配组员提交，配合项目将不同模块接入统一运行环境，并维护演示数据和运行包。项目文档方面，完成或更新了进度材料、用户操作与课程验收说明、</w:t>
                             </w:r>
+                            <w:proofErr w:type="spellStart"/>
                             <w:r>
                               <w:rPr>
                                 <w:rFonts w:eastAsia="宋体"/>
                                 <w:sz w:val="22"/>
                                 <w:lang w:eastAsia="zh-CN"/>
                               </w:rPr>
-                              <w:t xml:space="preserve">JavaDoc </w:t>
-                            </w:r>
-                            <w:proofErr w:type="spellStart"/>
+                              <w:t>JavaDoc</w:t>
+                            </w:r>
+                            <w:proofErr w:type="spellEnd"/>
                             <w:r>
                               <w:rPr>
                                 <w:rFonts w:eastAsia="宋体"/>
                                 <w:sz w:val="22"/>
                                 <w:lang w:eastAsia="zh-CN"/>
                               </w:rPr>
+                              <w:t xml:space="preserve"> </w:t>
+                            </w:r>
+                            <w:r>
+                              <w:rPr>
+                                <w:rFonts w:eastAsia="宋体"/>
+                                <w:sz w:val="22"/>
+                                <w:lang w:eastAsia="zh-CN"/>
+                              </w:rPr>
                               <w:t>及项目总结文档。工作从</w:t>
                             </w:r>
-                            <w:proofErr w:type="spellEnd"/>
                             <w:r>
                               <w:rPr>
                                 <w:rFonts w:eastAsia="宋体"/>
@@ -7047,7 +8261,25 @@
                                 <w:sz w:val="22"/>
                                 <w:lang w:eastAsia="zh-CN"/>
                               </w:rPr>
-                              <w:t>本次项目让我较完整地经历了业务需求梳理、数据结构设计、服务端实现、客户端交互和系统集成的过程这次项目让我体会到，用户管理并不只是登录和账号增删改查。角色权限、会话生命周期、密码变更、重复登录和异常审计彼此关联，一个环节处理不完整，就可能影响整个系统的安全性和使用体验。因此，我在实现功能时逐步加强了对边界情况的考虑，并通过补充测试来验证关键流程。</w:t>
+                              <w:t>本次项目让我较完整地经历了业务需求梳理、数据结构设计、服务端实现、客户端</w:t>
+                            </w:r>
+                            <w:proofErr w:type="gramStart"/>
+                            <w:r>
+                              <w:rPr>
+                                <w:rFonts w:eastAsia="宋体"/>
+                                <w:sz w:val="22"/>
+                                <w:lang w:eastAsia="zh-CN"/>
+                              </w:rPr>
+                              <w:t>交互和</w:t>
+                            </w:r>
+                            <w:proofErr w:type="gramEnd"/>
+                            <w:r>
+                              <w:rPr>
+                                <w:rFonts w:eastAsia="宋体"/>
+                                <w:sz w:val="22"/>
+                                <w:lang w:eastAsia="zh-CN"/>
+                              </w:rPr>
+                              <w:t>系统集成的过程这次项目让我体会到，用户管理并不只是登录和账号增删改查。角色权限、会话生命周期、密码变更、重复登录和异常审计彼此关联，一个环节处理不完整，就可能影响整个系统的安全性和使用体验。因此，我在实现功能时逐步加强了对边界情况的考虑，并通过补充测试来验证关键流程。</w:t>
                             </w:r>
                           </w:p>
                           <w:p>
@@ -7067,7 +8299,25 @@
                                 <w:sz w:val="22"/>
                                 <w:lang w:eastAsia="zh-CN"/>
                               </w:rPr>
-                              <w:t>我也认识到，跨模块协作需要保持接口和运行环境的一致。将用户模块与学生、课程等功能整合时，除了完成自身代码，还要关注权限定义、数据结构、客户端入口、测试数据和交付包之间的配合。后续如果继续完善项目，我会更早整理模块接口和验收标准，并在每次整合后及时进行完整回归验证，减少临近交付时集中处理兼容问题的情况。</w:t>
+                              <w:t>我也认识到，跨模块协作需要保持接口和运行环境的一致。将用户模块与学生、课程等功能整合时，除了完成自身代码，还要关注权限定义、数据结构、客户端入口、测试数据和交付</w:t>
+                            </w:r>
+                            <w:proofErr w:type="gramStart"/>
+                            <w:r>
+                              <w:rPr>
+                                <w:rFonts w:eastAsia="宋体"/>
+                                <w:sz w:val="22"/>
+                                <w:lang w:eastAsia="zh-CN"/>
+                              </w:rPr>
+                              <w:t>包之间</w:t>
+                            </w:r>
+                            <w:proofErr w:type="gramEnd"/>
+                            <w:r>
+                              <w:rPr>
+                                <w:rFonts w:eastAsia="宋体"/>
+                                <w:sz w:val="22"/>
+                                <w:lang w:eastAsia="zh-CN"/>
+                              </w:rPr>
+                              <w:t>的配合。后续如果继续完善项目，我会更早整理模块接口和验收标准，并在每次整合后及时进行完整回归验证，减少临近交付时集中处理兼容问题的情况。</w:t>
                             </w:r>
                           </w:p>
                           <w:p>
@@ -7081,7 +8331,6 @@
                                 <w:lang w:eastAsia="zh-CN"/>
                               </w:rPr>
                             </w:pPr>
-                            <w:proofErr w:type="spellStart"/>
                             <w:r>
                               <w:rPr>
                                 <w:rFonts w:eastAsia="宋体"/>
@@ -7104,16 +8353,7 @@
                                 <w:sz w:val="22"/>
                                 <w:lang w:eastAsia="zh-CN"/>
                               </w:rPr>
-                              <w:t>多模块项目的理解，也让我在功能拆分、测试设计、问题排查和团队协作方面积累了实践经验</w:t>
-                            </w:r>
-                            <w:proofErr w:type="spellEnd"/>
-                            <w:r>
-                              <w:rPr>
-                                <w:rFonts w:eastAsia="宋体"/>
-                                <w:sz w:val="22"/>
-                                <w:lang w:eastAsia="zh-CN"/>
-                              </w:rPr>
-                              <w:t>。</w:t>
+                              <w:t>多模块项目的理解，也让我在功能拆分、测试设计、问题排查和团队协作方面积累了实践经验。</w:t>
                             </w:r>
                           </w:p>
                           <w:p>
@@ -8099,7 +9339,7 @@
       <w:pPr>
         <w:spacing w:before="0" w:after="0"/>
         <w:rPr>
-          <w:rFonts w:ascii="Arial" w:eastAsia="黑体" w:hAnsi="Arial" w:cstheme="minorBidi" w:hint="eastAsia"/>
+          <w:rFonts w:ascii="Arial" w:eastAsia="黑体" w:hAnsi="Arial" w:cstheme="minorBidi"/>
           <w:b/>
           <w:color w:val="000000"/>
           <w:kern w:val="2"/>
@@ -8467,8 +9707,9 @@
                                 <w:szCs w:val="22"/>
                                 <w:lang w:eastAsia="zh-CN"/>
                               </w:rPr>
-                              <w:t>我完成了图书管理模块的主要功能开发。学生和教师端可按关键字、分类和可借状态检索书目、查看详情与馆藏副本，并完成借阅、归还、续借以及查询本人当前借阅和历史；管理员端在</w:t>
-                            </w:r>
+                              <w:t>我完成了图书管理模块的主要功能开发。学生和</w:t>
+                            </w:r>
+                            <w:proofErr w:type="gramStart"/>
                             <w:r>
                               <w:rPr>
                                 <w:rFonts w:eastAsia="宋体" w:hint="eastAsia"/>
@@ -8477,6 +9718,27 @@
                                 <w:szCs w:val="22"/>
                                 <w:lang w:eastAsia="zh-CN"/>
                               </w:rPr>
+                              <w:t>教师端可按</w:t>
+                            </w:r>
+                            <w:proofErr w:type="gramEnd"/>
+                            <w:r>
+                              <w:rPr>
+                                <w:rFonts w:eastAsia="宋体" w:hint="eastAsia"/>
+                                <w:bCs/>
+                                <w:color w:val="000000"/>
+                                <w:szCs w:val="22"/>
+                                <w:lang w:eastAsia="zh-CN"/>
+                              </w:rPr>
+                              <w:t>关键字、分类和可借状态检索书目、查看详情与馆藏副本，并完成借阅、归还、续借以及查询本人当前借阅和历史；管理员端在</w:t>
+                            </w:r>
+                            <w:r>
+                              <w:rPr>
+                                <w:rFonts w:eastAsia="宋体" w:hint="eastAsia"/>
+                                <w:bCs/>
+                                <w:color w:val="000000"/>
+                                <w:szCs w:val="22"/>
+                                <w:lang w:eastAsia="zh-CN"/>
+                              </w:rPr>
                               <w:t xml:space="preserve"> LIBRARY_ADMIN </w:t>
                             </w:r>
                             <w:r>
@@ -8487,19 +9749,9 @@
                                 <w:szCs w:val="22"/>
                                 <w:lang w:eastAsia="zh-CN"/>
                               </w:rPr>
-                              <w:t>权限下实现书目的新建、编辑与启停，副本的新增与状态维护，按账号查询和处理借阅，以及学生、教师借阅策略的配置。借阅策略保存在数据库中，更新后只影响后续借阅，不追溯修改已有记录。</w:t>
-                            </w:r>
-                          </w:p>
-                          <w:p>
-                            <w:pPr>
-                              <w:rPr>
-                                <w:rFonts w:eastAsia="宋体"/>
-                                <w:bCs/>
-                                <w:color w:val="000000"/>
-                                <w:szCs w:val="22"/>
-                                <w:lang w:eastAsia="zh-CN"/>
-                              </w:rPr>
-                            </w:pPr>
+                              <w:t>权限下实现书目的新建、编辑与启停，副本的新增与状态维护，按账号查询和处理借阅，以及学生、教师借阅策略的配置。借阅策略保存在数据库中，更新后只影响后续借阅，</w:t>
+                            </w:r>
+                            <w:proofErr w:type="gramStart"/>
                             <w:r>
                               <w:rPr>
                                 <w:rFonts w:eastAsia="宋体" w:hint="eastAsia"/>
@@ -8508,6 +9760,38 @@
                                 <w:szCs w:val="22"/>
                                 <w:lang w:eastAsia="zh-CN"/>
                               </w:rPr>
+                              <w:t>不</w:t>
+                            </w:r>
+                            <w:proofErr w:type="gramEnd"/>
+                            <w:r>
+                              <w:rPr>
+                                <w:rFonts w:eastAsia="宋体" w:hint="eastAsia"/>
+                                <w:bCs/>
+                                <w:color w:val="000000"/>
+                                <w:szCs w:val="22"/>
+                                <w:lang w:eastAsia="zh-CN"/>
+                              </w:rPr>
+                              <w:t>追溯修改已有记录。</w:t>
+                            </w:r>
+                          </w:p>
+                          <w:p>
+                            <w:pPr>
+                              <w:rPr>
+                                <w:rFonts w:eastAsia="宋体"/>
+                                <w:bCs/>
+                                <w:color w:val="000000"/>
+                                <w:szCs w:val="22"/>
+                                <w:lang w:eastAsia="zh-CN"/>
+                              </w:rPr>
+                            </w:pPr>
+                            <w:r>
+                              <w:rPr>
+                                <w:rFonts w:eastAsia="宋体" w:hint="eastAsia"/>
+                                <w:bCs/>
+                                <w:color w:val="000000"/>
+                                <w:szCs w:val="22"/>
+                                <w:lang w:eastAsia="zh-CN"/>
+                              </w:rPr>
                               <w:tab/>
                             </w:r>
                             <w:r>
@@ -8648,13 +9932,23 @@
                           <w:p>
                             <w:pPr>
                               <w:rPr>
+                                <w:rFonts w:eastAsia="宋体"/>
+                                <w:bCs/>
+                                <w:color w:val="000000"/>
+                                <w:szCs w:val="22"/>
+                                <w:lang w:eastAsia="zh-CN"/>
+                              </w:rPr>
+                            </w:pPr>
+                            <w:r>
+                              <w:rPr>
                                 <w:rFonts w:eastAsia="宋体" w:hint="eastAsia"/>
                                 <w:bCs/>
                                 <w:color w:val="000000"/>
                                 <w:szCs w:val="22"/>
                                 <w:lang w:eastAsia="zh-CN"/>
                               </w:rPr>
-                            </w:pPr>
+                              <w:tab/>
+                            </w:r>
                             <w:r>
                               <w:rPr>
                                 <w:rFonts w:eastAsia="宋体" w:hint="eastAsia"/>
@@ -8663,8 +9957,9 @@
                                 <w:szCs w:val="22"/>
                                 <w:lang w:eastAsia="zh-CN"/>
                               </w:rPr>
-                              <w:tab/>
-                            </w:r>
+                              <w:t>在模块对接与联调方面，我完成了图书模块与用户模块的整合，处理会话身份解析、权限校验、服务端处理器注册、</w:t>
+                            </w:r>
+                            <w:proofErr w:type="gramStart"/>
                             <w:r>
                               <w:rPr>
                                 <w:rFonts w:eastAsia="宋体" w:hint="eastAsia"/>
@@ -8673,7 +9968,18 @@
                                 <w:szCs w:val="22"/>
                                 <w:lang w:eastAsia="zh-CN"/>
                               </w:rPr>
-                              <w:t>在模块对接与联调方面，我完成了图书模块与用户模块的整合，处理会话身份解析、权限校验、服务端处理器注册、数据库建表与默认策略初始化，并支持管理员归还与报失处置，保证借阅页面、历史与副本状态使用同一份服务端事实。随后补充了罚金与借阅结束的对接。我编写了图书模块</w:t>
+                              <w:t>数据库建表与</w:t>
+                            </w:r>
+                            <w:proofErr w:type="gramEnd"/>
+                            <w:r>
+                              <w:rPr>
+                                <w:rFonts w:eastAsia="宋体" w:hint="eastAsia"/>
+                                <w:bCs/>
+                                <w:color w:val="000000"/>
+                                <w:szCs w:val="22"/>
+                                <w:lang w:eastAsia="zh-CN"/>
+                              </w:rPr>
+                              <w:t>默认策略初始化，并支持管理员归还与报失处置，保证借阅页面、历史与副本状态使用同一份服务端事实。随后补充了罚金与借阅结束的对接。我编写了图书模块</w:t>
                             </w:r>
                             <w:r>
                               <w:rPr>
@@ -8761,7 +10067,73 @@
                                 <w:szCs w:val="22"/>
                                 <w:lang w:eastAsia="zh-CN"/>
                               </w:rPr>
-                              <w:t>本次项目让我更深入地理解了图书借阅业务从需求分析、数据模型设计、服务端规则实现到客户端交互和跨模块集成的全过程。借阅看似只是借和还，实际涉及书目与副本的区分、副本状态机、借阅上限、逾期判定、续借规则及丢失损坏处理等约束。通过这个模块我意识到，业务规则必须由服务端统一校验，借阅记录与副本状态必须在同一事务中修改，并配合请求去重与乐观锁，才能在网络重发和并发情况下保证数据正确。</w:t>
+                              <w:t>本次项目让我更深入地理解了图书借阅业务从需求分析、数据模型设计、服务端规则实现到客户端</w:t>
+                            </w:r>
+                            <w:proofErr w:type="gramStart"/>
+                            <w:r>
+                              <w:rPr>
+                                <w:rFonts w:eastAsia="宋体" w:hint="eastAsia"/>
+                                <w:bCs/>
+                                <w:color w:val="000000"/>
+                                <w:szCs w:val="22"/>
+                                <w:lang w:eastAsia="zh-CN"/>
+                              </w:rPr>
+                              <w:t>交互和</w:t>
+                            </w:r>
+                            <w:proofErr w:type="gramEnd"/>
+                            <w:r>
+                              <w:rPr>
+                                <w:rFonts w:eastAsia="宋体" w:hint="eastAsia"/>
+                                <w:bCs/>
+                                <w:color w:val="000000"/>
+                                <w:szCs w:val="22"/>
+                                <w:lang w:eastAsia="zh-CN"/>
+                              </w:rPr>
+                              <w:t>跨模块集成的全过程。借阅看似</w:t>
+                            </w:r>
+                            <w:proofErr w:type="gramStart"/>
+                            <w:r>
+                              <w:rPr>
+                                <w:rFonts w:eastAsia="宋体" w:hint="eastAsia"/>
+                                <w:bCs/>
+                                <w:color w:val="000000"/>
+                                <w:szCs w:val="22"/>
+                                <w:lang w:eastAsia="zh-CN"/>
+                              </w:rPr>
+                              <w:t>只是借和还</w:t>
+                            </w:r>
+                            <w:proofErr w:type="gramEnd"/>
+                            <w:r>
+                              <w:rPr>
+                                <w:rFonts w:eastAsia="宋体" w:hint="eastAsia"/>
+                                <w:bCs/>
+                                <w:color w:val="000000"/>
+                                <w:szCs w:val="22"/>
+                                <w:lang w:eastAsia="zh-CN"/>
+                              </w:rPr>
+                              <w:t>，实际涉及书目与副本的区分、副本状态机、借阅上限、逾期判定、续借规则及丢失损坏处理等约束。通过这个模块我意识到，业务规则必须由服务</w:t>
+                            </w:r>
+                            <w:proofErr w:type="gramStart"/>
+                            <w:r>
+                              <w:rPr>
+                                <w:rFonts w:eastAsia="宋体" w:hint="eastAsia"/>
+                                <w:bCs/>
+                                <w:color w:val="000000"/>
+                                <w:szCs w:val="22"/>
+                                <w:lang w:eastAsia="zh-CN"/>
+                              </w:rPr>
+                              <w:t>端统一</w:t>
+                            </w:r>
+                            <w:proofErr w:type="gramEnd"/>
+                            <w:r>
+                              <w:rPr>
+                                <w:rFonts w:eastAsia="宋体" w:hint="eastAsia"/>
+                                <w:bCs/>
+                                <w:color w:val="000000"/>
+                                <w:szCs w:val="22"/>
+                                <w:lang w:eastAsia="zh-CN"/>
+                              </w:rPr>
+                              <w:t>校验，借阅记录与副本状态必须在同一事务中修改，并配合请求去重与乐观锁，才能在网络重发和并发情况下保证数据正确。</w:t>
                             </w:r>
                           </w:p>
                           <w:p>

</xml_diff>